<commit_message>
Polish README for public release; add MIT license; regenerate printable docx.
</commit_message>
<xml_diff>
--- a/genomics.docx
+++ b/genomics.docx
@@ -2,13 +2,13 @@
 <file path=word/document.xml><?xml version="1.0" encoding="utf-8"?>
 <w:document xmlns:w="http://schemas.openxmlformats.org/wordprocessingml/2006/main" xmlns:m="http://schemas.openxmlformats.org/officeDocument/2006/math" xmlns:r="http://schemas.openxmlformats.org/officeDocument/2006/relationships" xmlns:o="urn:schemas-microsoft-com:office:office" xmlns:v="urn:schemas-microsoft-com:vml" xmlns:w10="urn:schemas-microsoft-com:office:word" xmlns:a="http://schemas.openxmlformats.org/drawingml/2006/main" xmlns:pic="http://schemas.openxmlformats.org/drawingml/2006/picture" xmlns:wp="http://schemas.openxmlformats.org/drawingml/2006/wordprocessingDrawing">
   <w:body>
-    <w:bookmarkStart w:id="47" w:name="X631ef19374afd2356ab5c3cc1357654fa36f1ff"/>
+    <w:bookmarkStart w:id="52" w:name="genomics-for-software-engineers"/>
     <w:p>
       <w:pPr>
         <w:pStyle w:val="Heading1"/>
       </w:pPr>
       <w:r>
-        <w:t xml:space="preserve">Genomics for Software Engineers — Year 1 Curriculum</w:t>
+        <w:t xml:space="preserve">Genomics for Software Engineers</w:t>
       </w:r>
     </w:p>
     <w:p>
@@ -16,16 +16,72 @@
         <w:pStyle w:val="FirstParagraph"/>
       </w:pPr>
       <w:r>
-        <w:t xml:space="preserve">A progressive, self-contained study guide that builds from molecular biology fundamentals to fluency in genomics file formats and CLI tools.</w:t>
-      </w:r>
-    </w:p>
-    <w:bookmarkStart w:id="20" w:name="target-audience"/>
+        <w:rPr>
+          <w:i/>
+          <w:iCs/>
+        </w:rPr>
+        <w:t xml:space="preserve">A hands-on, 12-week crash course that teaches you minimum-viable biology — and maximum practical bioinformatics.</w:t>
+      </w:r>
+    </w:p>
+    <w:p>
+      <w:r>
+        <w:pict>
+          <v:rect style="width:0;height:1.5pt" o:hralign="center" o:hrstd="t" o:hr="t"/>
+        </w:pict>
+      </w:r>
+    </w:p>
+    <w:bookmarkStart w:id="20" w:name="the-story"/>
     <w:p>
       <w:pPr>
         <w:pStyle w:val="Heading2"/>
       </w:pPr>
       <w:r>
-        <w:t xml:space="preserve">Target Audience</w:t>
+        <w:t xml:space="preserve">The Story</w:t>
+      </w:r>
+    </w:p>
+    <w:p>
+      <w:pPr>
+        <w:pStyle w:val="FirstParagraph"/>
+      </w:pPr>
+      <w:r>
+        <w:t xml:space="preserve">I joined a project that needed genomics. I’m a software engineer, not a biologist — and everything I found sat at two extremes: PhD-level textbooks, and tool docs written for people who already know the field. Nothing bridged the gap for engineers whose career is already aligned to shipping software.</w:t>
+      </w:r>
+    </w:p>
+    <w:p>
+      <w:pPr>
+        <w:pStyle w:val="BodyText"/>
+      </w:pPr>
+      <w:r>
+        <w:t xml:space="preserve">So I built my own curriculum. DNA became a data structure; the sequencer became a physical-to-digital converter; alignment became a string-matching problem; FASTA and VCF became data contracts. Just enough biology to understand what the data means, and deep engineering practice on the tools real pipelines run.</w:t>
+      </w:r>
+    </w:p>
+    <w:p>
+      <w:pPr>
+        <w:pStyle w:val="BodyText"/>
+      </w:pPr>
+      <w:r>
+        <w:rPr>
+          <w:b/>
+          <w:bCs/>
+        </w:rPr>
+        <w:t xml:space="preserve">This repo is that curriculum — the resource I wish existed before I started.</w:t>
+      </w:r>
+    </w:p>
+    <w:p>
+      <w:r>
+        <w:pict>
+          <v:rect style="width:0;height:1.5pt" o:hralign="center" o:hrstd="t" o:hr="t"/>
+        </w:pict>
+      </w:r>
+    </w:p>
+    <w:bookmarkEnd w:id="20"/>
+    <w:bookmarkStart w:id="21" w:name="what-youll-be-able-to-do"/>
+    <w:p>
+      <w:pPr>
+        <w:pStyle w:val="Heading2"/>
+      </w:pPr>
+      <w:r>
+        <w:t xml:space="preserve">What You’ll Be Able to Do</w:t>
       </w:r>
     </w:p>
     <w:p>
@@ -37,7 +93,7 @@
         </w:numPr>
       </w:pPr>
       <w:r>
-        <w:t xml:space="preserve">Software engineers transitioning into bioinformatics / platform engineering</w:t>
+        <w:t xml:space="preserve">Explain a sequencing pipeline end-to-end, in engineering terms</w:t>
       </w:r>
     </w:p>
     <w:p>
@@ -49,7 +105,7 @@
         </w:numPr>
       </w:pPr>
       <w:r>
-        <w:t xml:space="preserve">Already comfortable with Linux CLI, at least one programming language (preferably C# or Python)</w:t>
+        <w:t xml:space="preserve">Read, write, and manipulate FASTQ, BAM, CRAM, and VCF files</w:t>
       </w:r>
     </w:p>
     <w:p>
@@ -61,7 +117,68 @@
         </w:numPr>
       </w:pPr>
       <w:r>
-        <w:t xml:space="preserve">Want to reach a</w:t>
+        <w:t xml:space="preserve">Run quality control with FastQC and fastp</w:t>
+      </w:r>
+    </w:p>
+    <w:p>
+      <w:pPr>
+        <w:pStyle w:val="Compact"/>
+        <w:numPr>
+          <w:ilvl w:val="0"/>
+          <w:numId w:val="1001"/>
+        </w:numPr>
+      </w:pPr>
+      <w:r>
+        <w:t xml:space="preserve">Align reads with BWA and Minimap2</w:t>
+      </w:r>
+    </w:p>
+    <w:p>
+      <w:pPr>
+        <w:pStyle w:val="Compact"/>
+        <w:numPr>
+          <w:ilvl w:val="0"/>
+          <w:numId w:val="1001"/>
+        </w:numPr>
+      </w:pPr>
+      <w:r>
+        <w:t xml:space="preserve">Call and filter variants with SAMtools + BCFtools</w:t>
+      </w:r>
+    </w:p>
+    <w:p>
+      <w:pPr>
+        <w:pStyle w:val="Compact"/>
+        <w:numPr>
+          <w:ilvl w:val="0"/>
+          <w:numId w:val="1001"/>
+        </w:numPr>
+      </w:pPr>
+      <w:r>
+        <w:t xml:space="preserve">Reason about coverage, quality scores, and alignment confidence like a bioinformatician</w:t>
+      </w:r>
+    </w:p>
+    <w:p>
+      <w:r>
+        <w:pict>
+          <v:rect style="width:0;height:1.5pt" o:hralign="center" o:hrstd="t" o:hr="t"/>
+        </w:pict>
+      </w:r>
+    </w:p>
+    <w:bookmarkEnd w:id="21"/>
+    <w:bookmarkStart w:id="22" w:name="where-this-leads-real-pipelines"/>
+    <w:p>
+      <w:pPr>
+        <w:pStyle w:val="Heading2"/>
+      </w:pPr>
+      <w:r>
+        <w:t xml:space="preserve">Where This Leads — Real Pipelines</w:t>
+      </w:r>
+    </w:p>
+    <w:p>
+      <w:pPr>
+        <w:pStyle w:val="FirstParagraph"/>
+      </w:pPr>
+      <w:r>
+        <w:t xml:space="preserve">Everything here maps to real, production-grade bioinformatics workflows. The canonical example — and the one most cloud genomics platforms are built around — is</w:t>
       </w:r>
       <w:r>
         <w:t xml:space="preserve"> </w:t>
@@ -71,23 +188,374 @@
           <w:b/>
           <w:bCs/>
         </w:rPr>
-        <w:t xml:space="preserve">top-tier, high-earning</w:t>
-      </w:r>
-      <w:r>
-        <w:t xml:space="preserve"> </w:t>
-      </w:r>
-      <w:r>
-        <w:t xml:space="preserve">role combining genomics + cloud + full-stack skills</w:t>
-      </w:r>
-    </w:p>
-    <w:bookmarkEnd w:id="20"/>
-    <w:bookmarkStart w:id="21" w:name="what-youll-be-able-to-do"/>
+        <w:t xml:space="preserve">germline short-read variant calling</w:t>
+      </w:r>
+      <w:r>
+        <w:t xml:space="preserve">:</w:t>
+      </w:r>
+    </w:p>
+    <w:p>
+      <w:pPr>
+        <w:pStyle w:val="SourceCode"/>
+      </w:pPr>
+      <w:r>
+        <w:rPr>
+          <w:rStyle w:val="VerbatimChar"/>
+        </w:rPr>
+        <w:t xml:space="preserve">FASTQ ──▶ QC ──▶ Align ──▶ Clean ──▶ Call ──▶ Filter ──▶ VCF</w:t>
+      </w:r>
+      <w:r>
+        <w:br/>
+      </w:r>
+      <w:r>
+        <w:rPr>
+          <w:rStyle w:val="VerbatimChar"/>
+        </w:rPr>
+        <w:t xml:space="preserve">(fastp)   (BWA)  (SAMtools)  (BCFtools)       (final variants)</w:t>
+      </w:r>
+    </w:p>
+    <w:p>
+      <w:pPr>
+        <w:pStyle w:val="FirstParagraph"/>
+      </w:pPr>
+      <w:r>
+        <w:t xml:space="preserve">By the end of the curriculum you can build this end-to-end. The same skills generalize to:</w:t>
+      </w:r>
+    </w:p>
+    <w:tbl>
+      <w:tblPr>
+        <w:tblStyle w:val="Table"/>
+        <w:tblW w:type="pct" w:w="5000"/>
+        <w:tblLayout w:type="fixed"/>
+        <w:tblLook w:firstRow="1" w:lastRow="0" w:firstColumn="0" w:lastColumn="0" w:noHBand="0" w:noVBand="0" w:val="0020"/>
+      </w:tblPr>
+      <w:tblGrid>
+        <w:gridCol w:w="3443"/>
+        <w:gridCol w:w="4476"/>
+      </w:tblGrid>
+      <w:tr>
+        <w:trPr>
+          <w:tblHeader w:val="on"/>
+        </w:trPr>
+        <w:tc>
+          <w:tcPr/>
+          <w:p>
+            <w:pPr>
+              <w:pStyle w:val="Compact"/>
+            </w:pPr>
+            <w:r>
+              <w:t xml:space="preserve">Scenario</w:t>
+            </w:r>
+          </w:p>
+        </w:tc>
+        <w:tc>
+          <w:tcPr/>
+          <w:p>
+            <w:pPr>
+              <w:pStyle w:val="Compact"/>
+            </w:pPr>
+            <w:r>
+              <w:t xml:space="preserve">What you do</w:t>
+            </w:r>
+          </w:p>
+        </w:tc>
+      </w:tr>
+      <w:tr>
+        <w:tc>
+          <w:tcPr/>
+          <w:p>
+            <w:pPr>
+              <w:pStyle w:val="Compact"/>
+            </w:pPr>
+            <w:r>
+              <w:rPr>
+                <w:b/>
+                <w:bCs/>
+              </w:rPr>
+              <w:t xml:space="preserve">Whole-genome / exome variant calling</w:t>
+            </w:r>
+          </w:p>
+        </w:tc>
+        <w:tc>
+          <w:tcPr/>
+          <w:p>
+            <w:pPr>
+              <w:pStyle w:val="Compact"/>
+            </w:pPr>
+            <w:r>
+              <w:t xml:space="preserve">QC reads → align to a reference → process BAMs → call and filter SNVs/indels → analyze a VCF</w:t>
+            </w:r>
+          </w:p>
+        </w:tc>
+      </w:tr>
+      <w:tr>
+        <w:tc>
+          <w:tcPr/>
+          <w:p>
+            <w:pPr>
+              <w:pStyle w:val="Compact"/>
+            </w:pPr>
+            <w:r>
+              <w:rPr>
+                <w:b/>
+                <w:bCs/>
+              </w:rPr>
+              <w:t xml:space="preserve">RNA-seq / gene expression</w:t>
+            </w:r>
+          </w:p>
+        </w:tc>
+        <w:tc>
+          <w:tcPr/>
+          <w:p>
+            <w:pPr>
+              <w:pStyle w:val="Compact"/>
+            </w:pPr>
+            <w:r>
+              <w:t xml:space="preserve">Map reads to the transcriptome → count reads per gene → find differentially expressed genes</w:t>
+            </w:r>
+          </w:p>
+        </w:tc>
+      </w:tr>
+      <w:tr>
+        <w:tc>
+          <w:tcPr/>
+          <w:p>
+            <w:pPr>
+              <w:pStyle w:val="Compact"/>
+            </w:pPr>
+            <w:r>
+              <w:rPr>
+                <w:b/>
+                <w:bCs/>
+              </w:rPr>
+              <w:t xml:space="preserve">Long-read assembly (Nanopore/PacBio)</w:t>
+            </w:r>
+          </w:p>
+        </w:tc>
+        <w:tc>
+          <w:tcPr/>
+          <w:p>
+            <w:pPr>
+              <w:pStyle w:val="Compact"/>
+            </w:pPr>
+            <w:r>
+              <w:t xml:space="preserve">Align with Minimap2 → assemble/de novo → polish contigs</w:t>
+            </w:r>
+          </w:p>
+        </w:tc>
+      </w:tr>
+    </w:tbl>
+    <w:p>
+      <w:r>
+        <w:pict>
+          <v:rect style="width:0;height:1.5pt" o:hralign="center" o:hrstd="t" o:hr="t"/>
+        </w:pict>
+      </w:r>
+    </w:p>
+    <w:bookmarkEnd w:id="22"/>
+    <w:bookmarkStart w:id="23" w:name="tools-youll-master"/>
     <w:p>
       <w:pPr>
         <w:pStyle w:val="Heading2"/>
       </w:pPr>
       <w:r>
-        <w:t xml:space="preserve">What You’ll Be Able to Do</w:t>
+        <w:t xml:space="preserve">Tools You’ll Master</w:t>
+      </w:r>
+    </w:p>
+    <w:tbl>
+      <w:tblPr>
+        <w:tblStyle w:val="Table"/>
+        <w:tblW w:type="pct" w:w="5000"/>
+        <w:tblLayout w:type="fixed"/>
+        <w:tblLook w:firstRow="1" w:lastRow="0" w:firstColumn="0" w:lastColumn="0" w:noHBand="0" w:noVBand="0" w:val="0020"/>
+      </w:tblPr>
+      <w:tblGrid>
+        <w:gridCol w:w="2262"/>
+        <w:gridCol w:w="5657"/>
+      </w:tblGrid>
+      <w:tr>
+        <w:trPr>
+          <w:tblHeader w:val="on"/>
+        </w:trPr>
+        <w:tc>
+          <w:tcPr/>
+          <w:p>
+            <w:pPr>
+              <w:pStyle w:val="Compact"/>
+            </w:pPr>
+            <w:r>
+              <w:t xml:space="preserve">Tool</w:t>
+            </w:r>
+          </w:p>
+        </w:tc>
+        <w:tc>
+          <w:tcPr/>
+          <w:p>
+            <w:pPr>
+              <w:pStyle w:val="Compact"/>
+            </w:pPr>
+            <w:r>
+              <w:t xml:space="preserve">Where it fits</w:t>
+            </w:r>
+          </w:p>
+        </w:tc>
+      </w:tr>
+      <w:tr>
+        <w:tc>
+          <w:tcPr/>
+          <w:p>
+            <w:pPr>
+              <w:pStyle w:val="Compact"/>
+            </w:pPr>
+            <w:r>
+              <w:rPr>
+                <w:b/>
+                <w:bCs/>
+              </w:rPr>
+              <w:t xml:space="preserve">FastQC, fastp</w:t>
+            </w:r>
+          </w:p>
+        </w:tc>
+        <w:tc>
+          <w:tcPr/>
+          <w:p>
+            <w:pPr>
+              <w:pStyle w:val="Compact"/>
+            </w:pPr>
+            <w:r>
+              <w:t xml:space="preserve">Read quality reporting and trimming (QC stage)</w:t>
+            </w:r>
+          </w:p>
+        </w:tc>
+      </w:tr>
+      <w:tr>
+        <w:tc>
+          <w:tcPr/>
+          <w:p>
+            <w:pPr>
+              <w:pStyle w:val="Compact"/>
+            </w:pPr>
+            <w:r>
+              <w:rPr>
+                <w:b/>
+                <w:bCs/>
+              </w:rPr>
+              <w:t xml:space="preserve">BWA, Minimap2</w:t>
+            </w:r>
+          </w:p>
+        </w:tc>
+        <w:tc>
+          <w:tcPr/>
+          <w:p>
+            <w:pPr>
+              <w:pStyle w:val="Compact"/>
+            </w:pPr>
+            <w:r>
+              <w:t xml:space="preserve">Short-read and long-read alignment</w:t>
+            </w:r>
+          </w:p>
+        </w:tc>
+      </w:tr>
+      <w:tr>
+        <w:tc>
+          <w:tcPr/>
+          <w:p>
+            <w:pPr>
+              <w:pStyle w:val="Compact"/>
+            </w:pPr>
+            <w:r>
+              <w:rPr>
+                <w:b/>
+                <w:bCs/>
+              </w:rPr>
+              <w:t xml:space="preserve">SAMtools</w:t>
+            </w:r>
+          </w:p>
+        </w:tc>
+        <w:tc>
+          <w:tcPr/>
+          <w:p>
+            <w:pPr>
+              <w:pStyle w:val="Compact"/>
+            </w:pPr>
+            <w:r>
+              <w:t xml:space="preserve">The Swiss Army knife for BAM/CRAM manipulation</w:t>
+            </w:r>
+          </w:p>
+        </w:tc>
+      </w:tr>
+      <w:tr>
+        <w:tc>
+          <w:tcPr/>
+          <w:p>
+            <w:pPr>
+              <w:pStyle w:val="Compact"/>
+            </w:pPr>
+            <w:r>
+              <w:rPr>
+                <w:b/>
+                <w:bCs/>
+              </w:rPr>
+              <w:t xml:space="preserve">BCFtools</w:t>
+            </w:r>
+          </w:p>
+        </w:tc>
+        <w:tc>
+          <w:tcPr/>
+          <w:p>
+            <w:pPr>
+              <w:pStyle w:val="Compact"/>
+            </w:pPr>
+            <w:r>
+              <w:t xml:space="preserve">Variant calling, filtering, and statistics</w:t>
+            </w:r>
+          </w:p>
+        </w:tc>
+      </w:tr>
+      <w:tr>
+        <w:tc>
+          <w:tcPr/>
+          <w:p>
+            <w:pPr>
+              <w:pStyle w:val="Compact"/>
+            </w:pPr>
+            <w:r>
+              <w:rPr>
+                <w:b/>
+                <w:bCs/>
+              </w:rPr>
+              <w:t xml:space="preserve">FASTA, FASTQ, SAM/BAM/CRAM, VCF/BCF</w:t>
+            </w:r>
+          </w:p>
+        </w:tc>
+        <w:tc>
+          <w:tcPr/>
+          <w:p>
+            <w:pPr>
+              <w:pStyle w:val="Compact"/>
+            </w:pPr>
+            <w:r>
+              <w:t xml:space="preserve">Full format fluency — you’ll parse and write these by hand and from code</w:t>
+            </w:r>
+          </w:p>
+        </w:tc>
+      </w:tr>
+    </w:tbl>
+    <w:p>
+      <w:r>
+        <w:pict>
+          <v:rect style="width:0;height:1.5pt" o:hralign="center" o:hrstd="t" o:hr="t"/>
+        </w:pict>
+      </w:r>
+    </w:p>
+    <w:bookmarkEnd w:id="23"/>
+    <w:bookmarkStart w:id="24" w:name="target-audience"/>
+    <w:p>
+      <w:pPr>
+        <w:pStyle w:val="Heading2"/>
+      </w:pPr>
+      <w:r>
+        <w:t xml:space="preserve">Target Audience</w:t>
       </w:r>
     </w:p>
     <w:p>
@@ -99,7 +567,7 @@
         </w:numPr>
       </w:pPr>
       <w:r>
-        <w:t xml:space="preserve">Explain a sequencing pipeline end-to-end</w:t>
+        <w:t xml:space="preserve">Software engineers transitioning into bioinformatics / platform engineering</w:t>
       </w:r>
     </w:p>
     <w:p>
@@ -111,7 +579,7 @@
         </w:numPr>
       </w:pPr>
       <w:r>
-        <w:t xml:space="preserve">Read, write, and manipulate FASTQ, BAM, CRAM, and VCF files</w:t>
+        <w:t xml:space="preserve">Already comfortable with Linux CLI, at least one programming language (preferably C# or Python)</w:t>
       </w:r>
     </w:p>
     <w:p>
@@ -123,35 +591,27 @@
         </w:numPr>
       </w:pPr>
       <w:r>
-        <w:t xml:space="preserve">Run quality control with FastQC and fastp</w:t>
-      </w:r>
-    </w:p>
-    <w:p>
-      <w:pPr>
-        <w:pStyle w:val="Compact"/>
-        <w:numPr>
-          <w:ilvl w:val="0"/>
-          <w:numId w:val="1002"/>
-        </w:numPr>
-      </w:pPr>
-      <w:r>
-        <w:t xml:space="preserve">Align reads with BWA and Minimap2</w:t>
-      </w:r>
-    </w:p>
-    <w:p>
-      <w:pPr>
-        <w:pStyle w:val="Compact"/>
-        <w:numPr>
-          <w:ilvl w:val="0"/>
-          <w:numId w:val="1002"/>
-        </w:numPr>
-      </w:pPr>
-      <w:r>
-        <w:t xml:space="preserve">Call and filter variants with SAMtools + BCFtools</w:t>
-      </w:r>
-    </w:p>
-    <w:bookmarkEnd w:id="21"/>
-    <w:bookmarkStart w:id="22" w:name="structure"/>
+        <w:t xml:space="preserve">Want to reach a</w:t>
+      </w:r>
+      <w:r>
+        <w:t xml:space="preserve"> </w:t>
+      </w:r>
+      <w:r>
+        <w:rPr>
+          <w:b/>
+          <w:bCs/>
+        </w:rPr>
+        <w:t xml:space="preserve">top-tier, high-earning</w:t>
+      </w:r>
+      <w:r>
+        <w:t xml:space="preserve"> </w:t>
+      </w:r>
+      <w:r>
+        <w:t xml:space="preserve">role combining genomics + cloud + full-stack skills</w:t>
+      </w:r>
+    </w:p>
+    <w:bookmarkEnd w:id="24"/>
+    <w:bookmarkStart w:id="25" w:name="structure"/>
     <w:p>
       <w:pPr>
         <w:pStyle w:val="Heading2"/>
@@ -408,8 +868,8 @@
         <w:t xml:space="preserve">Total: ~142–204 hours core (~170–245 hours with 20% buffer) over 12 weeks (~14–20 hrs/week).</w:t>
       </w:r>
     </w:p>
-    <w:bookmarkEnd w:id="22"/>
-    <w:bookmarkStart w:id="23" w:name="how-to-use"/>
+    <w:bookmarkEnd w:id="25"/>
+    <w:bookmarkStart w:id="26" w:name="how-to-use"/>
     <w:p>
       <w:pPr>
         <w:pStyle w:val="Heading2"/>
@@ -458,8 +918,8 @@
         <w:t xml:space="preserve">— do them.</w:t>
       </w:r>
     </w:p>
-    <w:bookmarkEnd w:id="23"/>
-    <w:bookmarkStart w:id="39" w:name="lessons-at-a-glance"/>
+    <w:bookmarkEnd w:id="26"/>
+    <w:bookmarkStart w:id="42" w:name="lessons-at-a-glance"/>
     <w:p>
       <w:pPr>
         <w:pStyle w:val="Heading2"/>
@@ -548,7 +1008,7 @@
             <w:pPr>
               <w:pStyle w:val="Compact"/>
             </w:pPr>
-            <w:hyperlink r:id="rId24">
+            <w:hyperlink r:id="rId27">
               <w:r>
                 <w:rPr>
                   <w:rStyle w:val="Hyperlink"/>
@@ -599,7 +1059,7 @@
             <w:pPr>
               <w:pStyle w:val="Compact"/>
             </w:pPr>
-            <w:hyperlink r:id="rId25">
+            <w:hyperlink r:id="rId28">
               <w:r>
                 <w:rPr>
                   <w:rStyle w:val="Hyperlink"/>
@@ -650,7 +1110,7 @@
             <w:pPr>
               <w:pStyle w:val="Compact"/>
             </w:pPr>
-            <w:hyperlink r:id="rId26">
+            <w:hyperlink r:id="rId29">
               <w:r>
                 <w:rPr>
                   <w:rStyle w:val="Hyperlink"/>
@@ -701,7 +1161,7 @@
             <w:pPr>
               <w:pStyle w:val="Compact"/>
             </w:pPr>
-            <w:hyperlink r:id="rId27">
+            <w:hyperlink r:id="rId30">
               <w:r>
                 <w:rPr>
                   <w:rStyle w:val="Hyperlink"/>
@@ -752,7 +1212,7 @@
             <w:pPr>
               <w:pStyle w:val="Compact"/>
             </w:pPr>
-            <w:hyperlink r:id="rId28">
+            <w:hyperlink r:id="rId31">
               <w:r>
                 <w:rPr>
                   <w:rStyle w:val="Hyperlink"/>
@@ -803,7 +1263,7 @@
             <w:pPr>
               <w:pStyle w:val="Compact"/>
             </w:pPr>
-            <w:hyperlink r:id="rId29">
+            <w:hyperlink r:id="rId32">
               <w:r>
                 <w:rPr>
                   <w:rStyle w:val="Hyperlink"/>
@@ -854,7 +1314,7 @@
             <w:pPr>
               <w:pStyle w:val="Compact"/>
             </w:pPr>
-            <w:hyperlink r:id="rId30">
+            <w:hyperlink r:id="rId33">
               <w:r>
                 <w:rPr>
                   <w:rStyle w:val="Hyperlink"/>
@@ -905,7 +1365,7 @@
             <w:pPr>
               <w:pStyle w:val="Compact"/>
             </w:pPr>
-            <w:hyperlink r:id="rId31">
+            <w:hyperlink r:id="rId34">
               <w:r>
                 <w:rPr>
                   <w:rStyle w:val="Hyperlink"/>
@@ -956,7 +1416,7 @@
             <w:pPr>
               <w:pStyle w:val="Compact"/>
             </w:pPr>
-            <w:hyperlink r:id="rId32">
+            <w:hyperlink r:id="rId35">
               <w:r>
                 <w:rPr>
                   <w:rStyle w:val="Hyperlink"/>
@@ -1007,7 +1467,7 @@
             <w:pPr>
               <w:pStyle w:val="Compact"/>
             </w:pPr>
-            <w:hyperlink r:id="rId33">
+            <w:hyperlink r:id="rId36">
               <w:r>
                 <w:rPr>
                   <w:rStyle w:val="Hyperlink"/>
@@ -1058,7 +1518,7 @@
             <w:pPr>
               <w:pStyle w:val="Compact"/>
             </w:pPr>
-            <w:hyperlink r:id="rId34">
+            <w:hyperlink r:id="rId37">
               <w:r>
                 <w:rPr>
                   <w:rStyle w:val="Hyperlink"/>
@@ -1109,7 +1569,7 @@
             <w:pPr>
               <w:pStyle w:val="Compact"/>
             </w:pPr>
-            <w:hyperlink r:id="rId35">
+            <w:hyperlink r:id="rId38">
               <w:r>
                 <w:rPr>
                   <w:rStyle w:val="Hyperlink"/>
@@ -1160,7 +1620,7 @@
             <w:pPr>
               <w:pStyle w:val="Compact"/>
             </w:pPr>
-            <w:hyperlink r:id="rId36">
+            <w:hyperlink r:id="rId39">
               <w:r>
                 <w:rPr>
                   <w:rStyle w:val="Hyperlink"/>
@@ -1211,7 +1671,7 @@
             <w:pPr>
               <w:pStyle w:val="Compact"/>
             </w:pPr>
-            <w:hyperlink r:id="rId37">
+            <w:hyperlink r:id="rId40">
               <w:r>
                 <w:rPr>
                   <w:rStyle w:val="Hyperlink"/>
@@ -1262,7 +1722,7 @@
             <w:pPr>
               <w:pStyle w:val="Compact"/>
             </w:pPr>
-            <w:hyperlink r:id="rId38">
+            <w:hyperlink r:id="rId41">
               <w:r>
                 <w:rPr>
                   <w:rStyle w:val="Hyperlink"/>
@@ -1296,8 +1756,8 @@
         </w:tc>
       </w:tr>
     </w:tbl>
-    <w:bookmarkEnd w:id="39"/>
-    <w:bookmarkStart w:id="40" w:name="prerequisites"/>
+    <w:bookmarkEnd w:id="42"/>
+    <w:bookmarkStart w:id="43" w:name="prerequisites"/>
     <w:p>
       <w:pPr>
         <w:pStyle w:val="Heading2"/>
@@ -1430,8 +1890,8 @@
         </w:pict>
       </w:r>
     </w:p>
-    <w:bookmarkEnd w:id="40"/>
-    <w:bookmarkStart w:id="41" w:name="X07a9ccf827fc0c63b0219a458b6fc9f793514f7"/>
+    <w:bookmarkEnd w:id="43"/>
+    <w:bookmarkStart w:id="44" w:name="X07a9ccf827fc0c63b0219a458b6fc9f793514f7"/>
     <w:p>
       <w:pPr>
         <w:pStyle w:val="Heading2"/>
@@ -1538,7 +1998,7 @@
             <w:pPr>
               <w:pStyle w:val="Compact"/>
             </w:pPr>
-            <w:hyperlink r:id="rId24">
+            <w:hyperlink r:id="rId27">
               <w:r>
                 <w:rPr>
                   <w:rStyle w:val="VerbatimChar"/>
@@ -1589,7 +2049,7 @@
             <w:pPr>
               <w:pStyle w:val="Compact"/>
             </w:pPr>
-            <w:hyperlink r:id="rId25">
+            <w:hyperlink r:id="rId28">
               <w:r>
                 <w:rPr>
                   <w:rStyle w:val="VerbatimChar"/>
@@ -1640,7 +2100,7 @@
             <w:pPr>
               <w:pStyle w:val="Compact"/>
             </w:pPr>
-            <w:hyperlink r:id="rId26">
+            <w:hyperlink r:id="rId29">
               <w:r>
                 <w:rPr>
                   <w:rStyle w:val="VerbatimChar"/>
@@ -1691,7 +2151,7 @@
             <w:pPr>
               <w:pStyle w:val="Compact"/>
             </w:pPr>
-            <w:hyperlink r:id="rId27">
+            <w:hyperlink r:id="rId30">
               <w:r>
                 <w:rPr>
                   <w:rStyle w:val="VerbatimChar"/>
@@ -1742,7 +2202,7 @@
             <w:pPr>
               <w:pStyle w:val="Compact"/>
             </w:pPr>
-            <w:hyperlink r:id="rId28">
+            <w:hyperlink r:id="rId31">
               <w:r>
                 <w:rPr>
                   <w:rStyle w:val="VerbatimChar"/>
@@ -1813,8 +2273,8 @@
         </w:pict>
       </w:r>
     </w:p>
-    <w:bookmarkEnd w:id="41"/>
-    <w:bookmarkStart w:id="42" w:name="phase-2-sequencing-alignment-weeks-58"/>
+    <w:bookmarkEnd w:id="44"/>
+    <w:bookmarkStart w:id="45" w:name="phase-2-sequencing-alignment-weeks-58"/>
     <w:p>
       <w:pPr>
         <w:pStyle w:val="Heading2"/>
@@ -1921,7 +2381,7 @@
             <w:pPr>
               <w:pStyle w:val="Compact"/>
             </w:pPr>
-            <w:hyperlink r:id="rId29">
+            <w:hyperlink r:id="rId32">
               <w:r>
                 <w:rPr>
                   <w:rStyle w:val="VerbatimChar"/>
@@ -1972,7 +2432,7 @@
             <w:pPr>
               <w:pStyle w:val="Compact"/>
             </w:pPr>
-            <w:hyperlink r:id="rId30">
+            <w:hyperlink r:id="rId33">
               <w:r>
                 <w:rPr>
                   <w:rStyle w:val="VerbatimChar"/>
@@ -2023,7 +2483,7 @@
             <w:pPr>
               <w:pStyle w:val="Compact"/>
             </w:pPr>
-            <w:hyperlink r:id="rId31">
+            <w:hyperlink r:id="rId34">
               <w:r>
                 <w:rPr>
                   <w:rStyle w:val="VerbatimChar"/>
@@ -2074,7 +2534,7 @@
             <w:pPr>
               <w:pStyle w:val="Compact"/>
             </w:pPr>
-            <w:hyperlink r:id="rId32">
+            <w:hyperlink r:id="rId35">
               <w:r>
                 <w:rPr>
                   <w:rStyle w:val="VerbatimChar"/>
@@ -2125,7 +2585,7 @@
             <w:pPr>
               <w:pStyle w:val="Compact"/>
             </w:pPr>
-            <w:hyperlink r:id="rId33">
+            <w:hyperlink r:id="rId36">
               <w:r>
                 <w:rPr>
                   <w:rStyle w:val="VerbatimChar"/>
@@ -2196,8 +2656,8 @@
         </w:pict>
       </w:r>
     </w:p>
-    <w:bookmarkEnd w:id="42"/>
-    <w:bookmarkStart w:id="43" w:name="phase-3-file-formats-cli-tools-weeks-912"/>
+    <w:bookmarkEnd w:id="45"/>
+    <w:bookmarkStart w:id="46" w:name="phase-3-file-formats-cli-tools-weeks-912"/>
     <w:p>
       <w:pPr>
         <w:pStyle w:val="Heading2"/>
@@ -2304,7 +2764,7 @@
             <w:pPr>
               <w:pStyle w:val="Compact"/>
             </w:pPr>
-            <w:hyperlink r:id="rId34">
+            <w:hyperlink r:id="rId37">
               <w:r>
                 <w:rPr>
                   <w:rStyle w:val="VerbatimChar"/>
@@ -2355,7 +2815,7 @@
             <w:pPr>
               <w:pStyle w:val="Compact"/>
             </w:pPr>
-            <w:hyperlink r:id="rId35">
+            <w:hyperlink r:id="rId38">
               <w:r>
                 <w:rPr>
                   <w:rStyle w:val="VerbatimChar"/>
@@ -2406,7 +2866,7 @@
             <w:pPr>
               <w:pStyle w:val="Compact"/>
             </w:pPr>
-            <w:hyperlink r:id="rId36">
+            <w:hyperlink r:id="rId39">
               <w:r>
                 <w:rPr>
                   <w:rStyle w:val="VerbatimChar"/>
@@ -2457,7 +2917,7 @@
             <w:pPr>
               <w:pStyle w:val="Compact"/>
             </w:pPr>
-            <w:hyperlink r:id="rId37">
+            <w:hyperlink r:id="rId40">
               <w:r>
                 <w:rPr>
                   <w:rStyle w:val="VerbatimChar"/>
@@ -2508,7 +2968,7 @@
             <w:pPr>
               <w:pStyle w:val="Compact"/>
             </w:pPr>
-            <w:hyperlink r:id="rId38">
+            <w:hyperlink r:id="rId41">
               <w:r>
                 <w:rPr>
                   <w:rStyle w:val="VerbatimChar"/>
@@ -2624,8 +3084,8 @@
         </w:pict>
       </w:r>
     </w:p>
-    <w:bookmarkEnd w:id="43"/>
-    <w:bookmarkStart w:id="44" w:name="total-estimated-time"/>
+    <w:bookmarkEnd w:id="46"/>
+    <w:bookmarkStart w:id="47" w:name="total-estimated-time"/>
     <w:p>
       <w:pPr>
         <w:pStyle w:val="Heading2"/>
@@ -2864,8 +3324,8 @@
         </w:pict>
       </w:r>
     </w:p>
-    <w:bookmarkEnd w:id="44"/>
-    <w:bookmarkStart w:id="45" w:name="weekly-schedule-example"/>
+    <w:bookmarkEnd w:id="47"/>
+    <w:bookmarkStart w:id="48" w:name="weekly-schedule-example"/>
     <w:p>
       <w:pPr>
         <w:pStyle w:val="Heading2"/>
@@ -3222,8 +3682,8 @@
         </w:pict>
       </w:r>
     </w:p>
-    <w:bookmarkEnd w:id="45"/>
-    <w:bookmarkStart w:id="46" w:name="X3ab87bbe170d9f2399379120a890c27462cda18"/>
+    <w:bookmarkEnd w:id="48"/>
+    <w:bookmarkStart w:id="49" w:name="X3ab87bbe170d9f2399379120a890c27462cda18"/>
     <w:p>
       <w:pPr>
         <w:pStyle w:val="Heading2"/>
@@ -3454,80 +3914,6 @@
         </w:tc>
       </w:tr>
     </w:tbl>
-    <w:bookmarkEnd w:id="46"/>
-    <w:bookmarkEnd w:id="47"/>
-    <w:bookmarkStart w:id="62" w:name="dna-a-double-stranded-data-structure"/>
-    <w:p>
-      <w:pPr>
-        <w:pStyle w:val="Heading1"/>
-      </w:pPr>
-      <w:r>
-        <w:t xml:space="preserve">01 — DNA: A Double-Stranded Data Structure</w:t>
-      </w:r>
-    </w:p>
-    <w:p>
-      <w:pPr>
-        <w:pStyle w:val="FirstParagraph"/>
-      </w:pPr>
-      <w:r>
-        <w:rPr>
-          <w:b/>
-          <w:bCs/>
-        </w:rPr>
-        <w:t xml:space="preserve">Prerequisites:</w:t>
-      </w:r>
-      <w:r>
-        <w:t xml:space="preserve"> </w:t>
-      </w:r>
-      <w:r>
-        <w:t xml:space="preserve">None. This is the starting point.</w:t>
-      </w:r>
-    </w:p>
-    <w:p>
-      <w:pPr>
-        <w:pStyle w:val="BodyText"/>
-      </w:pPr>
-      <w:r>
-        <w:rPr>
-          <w:b/>
-          <w:bCs/>
-        </w:rPr>
-        <w:t xml:space="preserve">See also:</w:t>
-      </w:r>
-      <w:r>
-        <w:t xml:space="preserve"> </w:t>
-      </w:r>
-      <w:r>
-        <w:rPr>
-          <w:rStyle w:val="VerbatimChar"/>
-        </w:rPr>
-        <w:t xml:space="preserve">02-rna.md</w:t>
-      </w:r>
-      <w:r>
-        <w:t xml:space="preserve">,</w:t>
-      </w:r>
-      <w:r>
-        <w:t xml:space="preserve"> </w:t>
-      </w:r>
-      <w:r>
-        <w:rPr>
-          <w:rStyle w:val="VerbatimChar"/>
-        </w:rPr>
-        <w:t xml:space="preserve">03-genes-chromosomes.md</w:t>
-      </w:r>
-      <w:r>
-        <w:t xml:space="preserve">,</w:t>
-      </w:r>
-      <w:r>
-        <w:t xml:space="preserve"> </w:t>
-      </w:r>
-      <w:r>
-        <w:rPr>
-          <w:rStyle w:val="VerbatimChar"/>
-        </w:rPr>
-        <w:t xml:space="preserve">11-fasta-fastq.md</w:t>
-      </w:r>
-    </w:p>
     <w:p>
       <w:r>
         <w:pict>
@@ -3535,37 +3921,56 @@
         </w:pict>
       </w:r>
     </w:p>
-    <w:bookmarkStart w:id="48" w:name="the-big-idea"/>
+    <w:bookmarkEnd w:id="49"/>
+    <w:bookmarkStart w:id="51" w:name="license"/>
     <w:p>
       <w:pPr>
         <w:pStyle w:val="Heading2"/>
       </w:pPr>
       <w:r>
-        <w:t xml:space="preserve">The Big Idea</w:t>
+        <w:t xml:space="preserve">License</w:t>
       </w:r>
     </w:p>
     <w:p>
       <w:pPr>
         <w:pStyle w:val="FirstParagraph"/>
       </w:pPr>
-      <w:r>
-        <w:t xml:space="preserve">DNA is a</w:t>
-      </w:r>
-      <w:r>
-        <w:t xml:space="preserve"> </w:t>
-      </w:r>
+      <w:hyperlink r:id="rId50">
+        <w:r>
+          <w:rPr>
+            <w:rStyle w:val="Hyperlink"/>
+          </w:rPr>
+          <w:t xml:space="preserve">MIT</w:t>
+        </w:r>
+      </w:hyperlink>
+    </w:p>
+    <w:bookmarkEnd w:id="51"/>
+    <w:bookmarkEnd w:id="52"/>
+    <w:bookmarkStart w:id="67" w:name="dna-a-double-stranded-data-structure"/>
+    <w:p>
+      <w:pPr>
+        <w:pStyle w:val="Heading1"/>
+      </w:pPr>
+      <w:r>
+        <w:t xml:space="preserve">01 — DNA: A Double-Stranded Data Structure</w:t>
+      </w:r>
+    </w:p>
+    <w:p>
+      <w:pPr>
+        <w:pStyle w:val="FirstParagraph"/>
+      </w:pPr>
       <w:r>
         <w:rPr>
           <w:b/>
           <w:bCs/>
         </w:rPr>
-        <w:t xml:space="preserve">distributed, redundancy-backed, string-indexed data structure</w:t>
-      </w:r>
-      <w:r>
-        <w:t xml:space="preserve"> </w:t>
-      </w:r>
-      <w:r>
-        <w:t xml:space="preserve">that stores the source code of every living organism.</w:t>
+        <w:t xml:space="preserve">Prerequisites:</w:t>
+      </w:r>
+      <w:r>
+        <w:t xml:space="preserve"> </w:t>
+      </w:r>
+      <w:r>
+        <w:t xml:space="preserve">None. This is the starting point.</w:t>
       </w:r>
     </w:p>
     <w:p>
@@ -3573,7 +3978,44 @@
         <w:pStyle w:val="BodyText"/>
       </w:pPr>
       <w:r>
-        <w:t xml:space="preserve">If you’re a software engineer, think of it as a character array with strict validation rules, complementary backup copies, and a 4-character alphabet.</w:t>
+        <w:rPr>
+          <w:b/>
+          <w:bCs/>
+        </w:rPr>
+        <w:t xml:space="preserve">See also:</w:t>
+      </w:r>
+      <w:r>
+        <w:t xml:space="preserve"> </w:t>
+      </w:r>
+      <w:r>
+        <w:rPr>
+          <w:rStyle w:val="VerbatimChar"/>
+        </w:rPr>
+        <w:t xml:space="preserve">02-rna.md</w:t>
+      </w:r>
+      <w:r>
+        <w:t xml:space="preserve">,</w:t>
+      </w:r>
+      <w:r>
+        <w:t xml:space="preserve"> </w:t>
+      </w:r>
+      <w:r>
+        <w:rPr>
+          <w:rStyle w:val="VerbatimChar"/>
+        </w:rPr>
+        <w:t xml:space="preserve">03-genes-chromosomes.md</w:t>
+      </w:r>
+      <w:r>
+        <w:t xml:space="preserve">,</w:t>
+      </w:r>
+      <w:r>
+        <w:t xml:space="preserve"> </w:t>
+      </w:r>
+      <w:r>
+        <w:rPr>
+          <w:rStyle w:val="VerbatimChar"/>
+        </w:rPr>
+        <w:t xml:space="preserve">11-fasta-fastq.md</w:t>
       </w:r>
     </w:p>
     <w:p>
@@ -3583,8 +4025,56 @@
         </w:pict>
       </w:r>
     </w:p>
-    <w:bookmarkEnd w:id="48"/>
-    <w:bookmarkStart w:id="49" w:name="chemical-composition"/>
+    <w:bookmarkStart w:id="53" w:name="the-big-idea"/>
+    <w:p>
+      <w:pPr>
+        <w:pStyle w:val="Heading2"/>
+      </w:pPr>
+      <w:r>
+        <w:t xml:space="preserve">The Big Idea</w:t>
+      </w:r>
+    </w:p>
+    <w:p>
+      <w:pPr>
+        <w:pStyle w:val="FirstParagraph"/>
+      </w:pPr>
+      <w:r>
+        <w:t xml:space="preserve">DNA is a</w:t>
+      </w:r>
+      <w:r>
+        <w:t xml:space="preserve"> </w:t>
+      </w:r>
+      <w:r>
+        <w:rPr>
+          <w:b/>
+          <w:bCs/>
+        </w:rPr>
+        <w:t xml:space="preserve">distributed, redundancy-backed, string-indexed data structure</w:t>
+      </w:r>
+      <w:r>
+        <w:t xml:space="preserve"> </w:t>
+      </w:r>
+      <w:r>
+        <w:t xml:space="preserve">that stores the source code of every living organism.</w:t>
+      </w:r>
+    </w:p>
+    <w:p>
+      <w:pPr>
+        <w:pStyle w:val="BodyText"/>
+      </w:pPr>
+      <w:r>
+        <w:t xml:space="preserve">If you’re a software engineer, think of it as a character array with strict validation rules, complementary backup copies, and a 4-character alphabet.</w:t>
+      </w:r>
+    </w:p>
+    <w:p>
+      <w:r>
+        <w:pict>
+          <v:rect style="width:0;height:1.5pt" o:hralign="center" o:hrstd="t" o:hr="t"/>
+        </w:pict>
+      </w:r>
+    </w:p>
+    <w:bookmarkEnd w:id="53"/>
+    <w:bookmarkStart w:id="54" w:name="chemical-composition"/>
     <w:p>
       <w:pPr>
         <w:pStyle w:val="Heading2"/>
@@ -4069,8 +4559,8 @@
         </w:pict>
       </w:r>
     </w:p>
-    <w:bookmarkEnd w:id="49"/>
-    <w:bookmarkStart w:id="50" w:name="the-sugar-phosphate-backbone"/>
+    <w:bookmarkEnd w:id="54"/>
+    <w:bookmarkStart w:id="55" w:name="the-sugar-phosphate-backbone"/>
     <w:p>
       <w:pPr>
         <w:pStyle w:val="Heading2"/>
@@ -4141,8 +4631,8 @@
         </w:pict>
       </w:r>
     </w:p>
-    <w:bookmarkEnd w:id="50"/>
-    <w:bookmarkStart w:id="53" w:name="double-stranded-structure"/>
+    <w:bookmarkEnd w:id="55"/>
+    <w:bookmarkStart w:id="58" w:name="double-stranded-structure"/>
     <w:p>
       <w:pPr>
         <w:pStyle w:val="Heading2"/>
@@ -4320,7 +4810,7 @@
         <w:t xml:space="preserve">Software Analogy: Two synchronized servers in different data centers</w:t>
       </w:r>
     </w:p>
-    <w:bookmarkStart w:id="51" w:name="base-pairing-rules"/>
+    <w:bookmarkStart w:id="56" w:name="base-pairing-rules"/>
     <w:p>
       <w:pPr>
         <w:pStyle w:val="Heading3"/>
@@ -4710,8 +5200,8 @@
         <w:t xml:space="preserve">This is like maintaining two identical servers in different data centers. If one strand is damaged, the other serves as backup.</w:t>
       </w:r>
     </w:p>
-    <w:bookmarkEnd w:id="51"/>
-    <w:bookmarkStart w:id="52" w:name="directionality"/>
+    <w:bookmarkEnd w:id="56"/>
+    <w:bookmarkStart w:id="57" w:name="directionality"/>
     <w:p>
       <w:pPr>
         <w:pStyle w:val="Heading3"/>
@@ -4801,9 +5291,9 @@
         </w:pict>
       </w:r>
     </w:p>
-    <w:bookmarkEnd w:id="52"/>
-    <w:bookmarkEnd w:id="53"/>
-    <w:bookmarkStart w:id="54" w:name="the-information-is-in-the-sequence"/>
+    <w:bookmarkEnd w:id="57"/>
+    <w:bookmarkEnd w:id="58"/>
+    <w:bookmarkStart w:id="59" w:name="the-information-is-in-the-sequence"/>
     <w:p>
       <w:pPr>
         <w:pStyle w:val="Heading2"/>
@@ -4882,8 +5372,8 @@
         </w:pict>
       </w:r>
     </w:p>
-    <w:bookmarkEnd w:id="54"/>
-    <w:bookmarkStart w:id="55" w:name="dna-in-the-cell"/>
+    <w:bookmarkEnd w:id="59"/>
+    <w:bookmarkStart w:id="60" w:name="dna-in-the-cell"/>
     <w:p>
       <w:pPr>
         <w:pStyle w:val="Heading2"/>
@@ -4979,8 +5469,8 @@
         </w:pict>
       </w:r>
     </w:p>
-    <w:bookmarkEnd w:id="55"/>
-    <w:bookmarkStart w:id="56" w:name="key-operations-on-dna"/>
+    <w:bookmarkEnd w:id="60"/>
+    <w:bookmarkStart w:id="61" w:name="key-operations-on-dna"/>
     <w:p>
       <w:pPr>
         <w:pStyle w:val="Heading2"/>
@@ -5212,8 +5702,8 @@
         </w:pict>
       </w:r>
     </w:p>
-    <w:bookmarkEnd w:id="56"/>
-    <w:bookmarkStart w:id="57" w:name="the-central-dogma-preview"/>
+    <w:bookmarkEnd w:id="61"/>
+    <w:bookmarkStart w:id="62" w:name="the-central-dogma-preview"/>
     <w:p>
       <w:pPr>
         <w:pStyle w:val="Heading2"/>
@@ -5281,8 +5771,8 @@
         </w:pict>
       </w:r>
     </w:p>
-    <w:bookmarkEnd w:id="57"/>
-    <w:bookmarkStart w:id="58" w:name="why-this-matters-for-a-genomics-engineer"/>
+    <w:bookmarkEnd w:id="62"/>
+    <w:bookmarkStart w:id="63" w:name="why-this-matters-for-a-genomics-engineer"/>
     <w:p>
       <w:pPr>
         <w:pStyle w:val="Heading2"/>
@@ -5378,8 +5868,8 @@
         </w:pict>
       </w:r>
     </w:p>
-    <w:bookmarkEnd w:id="58"/>
-    <w:bookmarkStart w:id="59" w:name="exercises"/>
+    <w:bookmarkEnd w:id="63"/>
+    <w:bookmarkStart w:id="64" w:name="exercises"/>
     <w:p>
       <w:pPr>
         <w:pStyle w:val="Heading2"/>
@@ -5485,8 +5975,8 @@
         </w:pict>
       </w:r>
     </w:p>
-    <w:bookmarkEnd w:id="59"/>
-    <w:bookmarkStart w:id="60" w:name="key-terms"/>
+    <w:bookmarkEnd w:id="64"/>
+    <w:bookmarkStart w:id="65" w:name="key-terms"/>
     <w:p>
       <w:pPr>
         <w:pStyle w:val="Heading2"/>
@@ -5660,8 +6150,8 @@
         </w:pict>
       </w:r>
     </w:p>
-    <w:bookmarkEnd w:id="60"/>
-    <w:bookmarkStart w:id="61" w:name="next-steps"/>
+    <w:bookmarkEnd w:id="65"/>
+    <w:bookmarkStart w:id="66" w:name="next-steps"/>
     <w:p>
       <w:pPr>
         <w:pStyle w:val="Heading2"/>
@@ -5754,9 +6244,9 @@
         <w:t xml:space="preserve">“DNA is a data structure, not a mystery.”</w:t>
       </w:r>
     </w:p>
-    <w:bookmarkEnd w:id="61"/>
-    <w:bookmarkEnd w:id="62"/>
-    <w:bookmarkStart w:id="76" w:name="rna-the-transient-build-artifact"/>
+    <w:bookmarkEnd w:id="66"/>
+    <w:bookmarkEnd w:id="67"/>
+    <w:bookmarkStart w:id="81" w:name="rna-the-transient-build-artifact"/>
     <w:p>
       <w:pPr>
         <w:pStyle w:val="Heading1"/>
@@ -5826,7 +6316,7 @@
         </w:pict>
       </w:r>
     </w:p>
-    <w:bookmarkStart w:id="63" w:name="the-big-idea-1"/>
+    <w:bookmarkStart w:id="68" w:name="the-big-idea-1"/>
     <w:p>
       <w:pPr>
         <w:pStyle w:val="Heading2"/>
@@ -5879,8 +6369,8 @@
         </w:pict>
       </w:r>
     </w:p>
-    <w:bookmarkEnd w:id="63"/>
-    <w:bookmarkStart w:id="65" w:name="rna-vs-dna"/>
+    <w:bookmarkEnd w:id="68"/>
+    <w:bookmarkStart w:id="70" w:name="rna-vs-dna"/>
     <w:p>
       <w:pPr>
         <w:pStyle w:val="Heading2"/>
@@ -6390,7 +6880,7 @@
         </w:pict>
       </w:r>
     </w:p>
-    <w:bookmarkStart w:id="64" w:name="transcription-diagram"/>
+    <w:bookmarkStart w:id="69" w:name="transcription-diagram"/>
     <w:p>
       <w:pPr>
         <w:pStyle w:val="Heading3"/>
@@ -6644,9 +7134,9 @@
         <w:t xml:space="preserve">DNA Coding Strand = source file, RNA = intermediate build artifact (U replaces T like a transpiler step).</w:t>
       </w:r>
     </w:p>
-    <w:bookmarkEnd w:id="64"/>
-    <w:bookmarkEnd w:id="65"/>
-    <w:bookmarkStart w:id="66" w:name="how-rna-is-made-transcription"/>
+    <w:bookmarkEnd w:id="69"/>
+    <w:bookmarkEnd w:id="70"/>
+    <w:bookmarkStart w:id="71" w:name="how-rna-is-made-transcription"/>
     <w:p>
       <w:pPr>
         <w:pStyle w:val="Heading2"/>
@@ -6851,8 +7341,8 @@
         </w:pict>
       </w:r>
     </w:p>
-    <w:bookmarkEnd w:id="66"/>
-    <w:bookmarkStart w:id="67" w:name="types-of-rna"/>
+    <w:bookmarkEnd w:id="71"/>
+    <w:bookmarkStart w:id="72" w:name="types-of-rna"/>
     <w:p>
       <w:pPr>
         <w:pStyle w:val="Heading2"/>
@@ -7308,8 +7798,8 @@
         </w:pict>
       </w:r>
     </w:p>
-    <w:bookmarkEnd w:id="67"/>
-    <w:bookmarkStart w:id="69" w:name="X51c1b371e992c673683a47cc44125b0fcd8b4dc"/>
+    <w:bookmarkEnd w:id="72"/>
+    <w:bookmarkStart w:id="74" w:name="X51c1b371e992c673683a47cc44125b0fcd8b4dc"/>
     <w:p>
       <w:pPr>
         <w:pStyle w:val="Heading2"/>
@@ -7373,7 +7863,7 @@
         <w:t xml:space="preserve">Mature mRNA:  5'-CAP-[Exon 1]-[Exon 2]-[Exon 3]-AAAAA...-3'</w:t>
       </w:r>
     </w:p>
-    <w:bookmarkStart w:id="68" w:name="splicing-diagram"/>
+    <w:bookmarkStart w:id="73" w:name="splicing-diagram"/>
     <w:p>
       <w:pPr>
         <w:pStyle w:val="Heading3"/>
@@ -7802,9 +8292,9 @@
         </w:pict>
       </w:r>
     </w:p>
-    <w:bookmarkEnd w:id="68"/>
-    <w:bookmarkEnd w:id="69"/>
-    <w:bookmarkStart w:id="70" w:name="rna-stability-and-degradation"/>
+    <w:bookmarkEnd w:id="73"/>
+    <w:bookmarkEnd w:id="74"/>
+    <w:bookmarkStart w:id="75" w:name="rna-stability-and-degradation"/>
     <w:p>
       <w:pPr>
         <w:pStyle w:val="Heading2"/>
@@ -7996,8 +8486,8 @@
         </w:pict>
       </w:r>
     </w:p>
-    <w:bookmarkEnd w:id="70"/>
-    <w:bookmarkStart w:id="71" w:name="why-rna-matters-in-genomics"/>
+    <w:bookmarkEnd w:id="75"/>
+    <w:bookmarkStart w:id="76" w:name="why-rna-matters-in-genomics"/>
     <w:p>
       <w:pPr>
         <w:pStyle w:val="Heading2"/>
@@ -8317,8 +8807,8 @@
         </w:pict>
       </w:r>
     </w:p>
-    <w:bookmarkEnd w:id="71"/>
-    <w:bookmarkStart w:id="72" w:name="reverse-transcription-rna-dna"/>
+    <w:bookmarkEnd w:id="76"/>
+    <w:bookmarkStart w:id="77" w:name="reverse-transcription-rna-dna"/>
     <w:p>
       <w:pPr>
         <w:pStyle w:val="Heading2"/>
@@ -8468,8 +8958,8 @@
         </w:pict>
       </w:r>
     </w:p>
-    <w:bookmarkEnd w:id="72"/>
-    <w:bookmarkStart w:id="73" w:name="exercises-1"/>
+    <w:bookmarkEnd w:id="77"/>
+    <w:bookmarkStart w:id="78" w:name="exercises-1"/>
     <w:p>
       <w:pPr>
         <w:pStyle w:val="Heading2"/>
@@ -8575,8 +9065,8 @@
         </w:pict>
       </w:r>
     </w:p>
-    <w:bookmarkEnd w:id="73"/>
-    <w:bookmarkStart w:id="74" w:name="key-terms-1"/>
+    <w:bookmarkEnd w:id="78"/>
+    <w:bookmarkStart w:id="79" w:name="key-terms-1"/>
     <w:p>
       <w:pPr>
         <w:pStyle w:val="Heading2"/>
@@ -8822,8 +9312,8 @@
         </w:pict>
       </w:r>
     </w:p>
-    <w:bookmarkEnd w:id="74"/>
-    <w:bookmarkStart w:id="75" w:name="next-steps-1"/>
+    <w:bookmarkEnd w:id="79"/>
+    <w:bookmarkStart w:id="80" w:name="next-steps-1"/>
     <w:p>
       <w:pPr>
         <w:pStyle w:val="Heading2"/>
@@ -8895,9 +9385,9 @@
         <w:t xml:space="preserve">“RNA is the build artifact that makes biology reactive.”</w:t>
       </w:r>
     </w:p>
-    <w:bookmarkEnd w:id="75"/>
-    <w:bookmarkEnd w:id="76"/>
-    <w:bookmarkStart w:id="92" w:name="X15ac5d0b6451e60a86701d2b66f987d684244b5"/>
+    <w:bookmarkEnd w:id="80"/>
+    <w:bookmarkEnd w:id="81"/>
+    <w:bookmarkStart w:id="97" w:name="X15ac5d0b6451e60a86701d2b66f987d684244b5"/>
     <w:p>
       <w:pPr>
         <w:pStyle w:val="Heading1"/>
@@ -8979,7 +9469,7 @@
         </w:pict>
       </w:r>
     </w:p>
-    <w:bookmarkStart w:id="77" w:name="the-big-idea-2"/>
+    <w:bookmarkStart w:id="82" w:name="the-big-idea-2"/>
     <w:p>
       <w:pPr>
         <w:pStyle w:val="Heading2"/>
@@ -9051,8 +9541,8 @@
         </w:pict>
       </w:r>
     </w:p>
-    <w:bookmarkEnd w:id="77"/>
-    <w:bookmarkStart w:id="79" w:name="chromosomes-the-top-level-directories"/>
+    <w:bookmarkEnd w:id="82"/>
+    <w:bookmarkStart w:id="84" w:name="chromosomes-the-top-level-directories"/>
     <w:p>
       <w:pPr>
         <w:pStyle w:val="Heading2"/>
@@ -9475,7 +9965,7 @@
         <w:t xml:space="preserve">}</w:t>
       </w:r>
     </w:p>
-    <w:bookmarkStart w:id="78" w:name="ploidy"/>
+    <w:bookmarkStart w:id="83" w:name="ploidy"/>
     <w:p>
       <w:pPr>
         <w:pStyle w:val="Heading3"/>
@@ -9777,9 +10267,9 @@
         <w:t xml:space="preserve">  • Humans have 23 pairs of chromosomes</w:t>
       </w:r>
     </w:p>
-    <w:bookmarkEnd w:id="78"/>
-    <w:bookmarkEnd w:id="79"/>
-    <w:bookmarkStart w:id="80" w:name="chromosome-structure"/>
+    <w:bookmarkEnd w:id="83"/>
+    <w:bookmarkEnd w:id="84"/>
+    <w:bookmarkStart w:id="85" w:name="chromosome-structure"/>
     <w:p>
       <w:pPr>
         <w:pStyle w:val="Heading2"/>
@@ -10114,8 +10604,8 @@
         </w:pict>
       </w:r>
     </w:p>
-    <w:bookmarkEnd w:id="80"/>
-    <w:bookmarkStart w:id="81" w:name="karyotype"/>
+    <w:bookmarkEnd w:id="85"/>
+    <w:bookmarkStart w:id="86" w:name="karyotype"/>
     <w:p>
       <w:pPr>
         <w:pStyle w:val="Heading2"/>
@@ -10265,8 +10755,8 @@
         </w:pict>
       </w:r>
     </w:p>
-    <w:bookmarkEnd w:id="81"/>
-    <w:bookmarkStart w:id="85" w:name="genes-the-functional-units"/>
+    <w:bookmarkEnd w:id="86"/>
+    <w:bookmarkStart w:id="90" w:name="genes-the-functional-units"/>
     <w:p>
       <w:pPr>
         <w:pStyle w:val="Heading2"/>
@@ -10340,7 +10830,7 @@
         <w:t xml:space="preserve">File       = Gene       (~1–100 KB)</w:t>
       </w:r>
     </w:p>
-    <w:bookmarkStart w:id="82" w:name="how-many-genes"/>
+    <w:bookmarkStart w:id="87" w:name="how-many-genes"/>
     <w:p>
       <w:pPr>
         <w:pStyle w:val="Heading3"/>
@@ -10632,8 +11122,8 @@
         <w:t xml:space="preserve">  SWE Analogy: Gene = Source File, Exons = Included Modules, Introns = Comments/Debug Code</w:t>
       </w:r>
     </w:p>
-    <w:bookmarkEnd w:id="82"/>
-    <w:bookmarkStart w:id="83" w:name="gene-structure"/>
+    <w:bookmarkEnd w:id="87"/>
+    <w:bookmarkStart w:id="88" w:name="gene-structure"/>
     <w:p>
       <w:pPr>
         <w:pStyle w:val="Heading3"/>
@@ -10907,8 +11397,8 @@
         </w:tc>
       </w:tr>
     </w:tbl>
-    <w:bookmarkEnd w:id="83"/>
-    <w:bookmarkStart w:id="84" w:name="gene-naming-conventions"/>
+    <w:bookmarkEnd w:id="88"/>
+    <w:bookmarkStart w:id="89" w:name="gene-naming-conventions"/>
     <w:p>
       <w:pPr>
         <w:pStyle w:val="Heading3"/>
@@ -11076,9 +11566,9 @@
         </w:pict>
       </w:r>
     </w:p>
-    <w:bookmarkEnd w:id="84"/>
-    <w:bookmarkEnd w:id="85"/>
-    <w:bookmarkStart w:id="86" w:name="the-remaining-98.5-of-the-genome"/>
+    <w:bookmarkEnd w:id="89"/>
+    <w:bookmarkEnd w:id="90"/>
+    <w:bookmarkStart w:id="91" w:name="the-remaining-98.5-of-the-genome"/>
     <w:p>
       <w:pPr>
         <w:pStyle w:val="Heading2"/>
@@ -11424,8 +11914,8 @@
         </w:pict>
       </w:r>
     </w:p>
-    <w:bookmarkEnd w:id="86"/>
-    <w:bookmarkStart w:id="87" w:name="key-coordinate-systems"/>
+    <w:bookmarkEnd w:id="91"/>
+    <w:bookmarkStart w:id="92" w:name="key-coordinate-systems"/>
     <w:p>
       <w:pPr>
         <w:pStyle w:val="Heading2"/>
@@ -11734,8 +12224,8 @@
         </w:pict>
       </w:r>
     </w:p>
-    <w:bookmarkEnd w:id="87"/>
-    <w:bookmarkStart w:id="88" w:name="genome-assembly"/>
+    <w:bookmarkEnd w:id="92"/>
+    <w:bookmarkStart w:id="93" w:name="genome-assembly"/>
     <w:p>
       <w:pPr>
         <w:pStyle w:val="Heading2"/>
@@ -11810,8 +12300,8 @@
         </w:pict>
       </w:r>
     </w:p>
-    <w:bookmarkEnd w:id="88"/>
-    <w:bookmarkStart w:id="89" w:name="exercises-2"/>
+    <w:bookmarkEnd w:id="93"/>
+    <w:bookmarkStart w:id="94" w:name="exercises-2"/>
     <w:p>
       <w:pPr>
         <w:pStyle w:val="Heading2"/>
@@ -11920,8 +12410,8 @@
         </w:pict>
       </w:r>
     </w:p>
-    <w:bookmarkEnd w:id="89"/>
-    <w:bookmarkStart w:id="90" w:name="key-terms-2"/>
+    <w:bookmarkEnd w:id="94"/>
+    <w:bookmarkStart w:id="95" w:name="key-terms-2"/>
     <w:p>
       <w:pPr>
         <w:pStyle w:val="Heading2"/>
@@ -12192,8 +12682,8 @@
         </w:pict>
       </w:r>
     </w:p>
-    <w:bookmarkEnd w:id="90"/>
-    <w:bookmarkStart w:id="91" w:name="next-steps-2"/>
+    <w:bookmarkEnd w:id="95"/>
+    <w:bookmarkStart w:id="96" w:name="next-steps-2"/>
     <w:p>
       <w:pPr>
         <w:pStyle w:val="Heading2"/>
@@ -12265,9 +12755,9 @@
         <w:t xml:space="preserve">“The genome is a monorepo where most files are configuration, not code.”</w:t>
       </w:r>
     </w:p>
-    <w:bookmarkEnd w:id="91"/>
-    <w:bookmarkEnd w:id="92"/>
-    <w:bookmarkStart w:id="106" w:name="the-central-dogma-dna-rna-protein"/>
+    <w:bookmarkEnd w:id="96"/>
+    <w:bookmarkEnd w:id="97"/>
+    <w:bookmarkStart w:id="111" w:name="the-central-dogma-dna-rna-protein"/>
     <w:p>
       <w:pPr>
         <w:pStyle w:val="Heading1"/>
@@ -12349,7 +12839,7 @@
         </w:pict>
       </w:r>
     </w:p>
-    <w:bookmarkStart w:id="93" w:name="the-big-idea-3"/>
+    <w:bookmarkStart w:id="98" w:name="the-big-idea-3"/>
     <w:p>
       <w:pPr>
         <w:pStyle w:val="Heading2"/>
@@ -12692,8 +13182,8 @@
         <w:t xml:space="preserve">Information flows one way: DNA → RNA → Protein (Crick's original thesis)</w:t>
       </w:r>
     </w:p>
-    <w:bookmarkEnd w:id="93"/>
-    <w:bookmarkStart w:id="95" w:name="the-full-pipeline"/>
+    <w:bookmarkEnd w:id="98"/>
+    <w:bookmarkStart w:id="100" w:name="the-full-pipeline"/>
     <w:p>
       <w:pPr>
         <w:pStyle w:val="Heading2"/>
@@ -12887,7 +13377,7 @@
         <w:t xml:space="preserve">    Functional protein</w:t>
       </w:r>
     </w:p>
-    <w:bookmarkStart w:id="94" w:name="visualization"/>
+    <w:bookmarkStart w:id="99" w:name="visualization"/>
     <w:p>
       <w:pPr>
         <w:pStyle w:val="Heading3"/>
@@ -13049,9 +13539,9 @@
         </w:pict>
       </w:r>
     </w:p>
-    <w:bookmarkEnd w:id="94"/>
-    <w:bookmarkEnd w:id="95"/>
-    <w:bookmarkStart w:id="97" w:name="the-genetic-code-codons-amino-acids"/>
+    <w:bookmarkEnd w:id="99"/>
+    <w:bookmarkEnd w:id="100"/>
+    <w:bookmarkStart w:id="102" w:name="the-genetic-code-codons-amino-acids"/>
     <w:p>
       <w:pPr>
         <w:pStyle w:val="Heading2"/>
@@ -13148,7 +13638,7 @@
         <w:t xml:space="preserve">AAs:    Met        Ala       Tyr      STOP</w:t>
       </w:r>
     </w:p>
-    <w:bookmarkStart w:id="96" w:name="the-codon-table"/>
+    <w:bookmarkStart w:id="101" w:name="the-codon-table"/>
     <w:p>
       <w:pPr>
         <w:pStyle w:val="Heading3"/>
@@ -15604,9 +16094,9 @@
         </w:pict>
       </w:r>
     </w:p>
-    <w:bookmarkEnd w:id="96"/>
-    <w:bookmarkEnd w:id="97"/>
-    <w:bookmarkStart w:id="98" w:name="reading-frames"/>
+    <w:bookmarkEnd w:id="101"/>
+    <w:bookmarkEnd w:id="102"/>
+    <w:bookmarkStart w:id="103" w:name="reading-frames"/>
     <w:p>
       <w:pPr>
         <w:pStyle w:val="Heading2"/>
@@ -15876,8 +16366,8 @@
         <w:t xml:space="preserve">    E site: tRNA exits (write-back)</w:t>
       </w:r>
     </w:p>
-    <w:bookmarkEnd w:id="98"/>
-    <w:bookmarkStart w:id="99" w:name="translation-machinery"/>
+    <w:bookmarkEnd w:id="103"/>
+    <w:bookmarkStart w:id="104" w:name="translation-machinery"/>
     <w:p>
       <w:pPr>
         <w:pStyle w:val="Heading2"/>
@@ -16131,8 +16621,8 @@
         </w:pict>
       </w:r>
     </w:p>
-    <w:bookmarkEnd w:id="99"/>
-    <w:bookmarkStart w:id="100" w:name="protein-folding-the-final-step"/>
+    <w:bookmarkEnd w:id="104"/>
+    <w:bookmarkStart w:id="105" w:name="protein-folding-the-final-step"/>
     <w:p>
       <w:pPr>
         <w:pStyle w:val="Heading2"/>
@@ -16270,8 +16760,8 @@
         </w:pict>
       </w:r>
     </w:p>
-    <w:bookmarkEnd w:id="100"/>
-    <w:bookmarkStart w:id="101" w:name="the-complete-software-analogy"/>
+    <w:bookmarkEnd w:id="105"/>
+    <w:bookmarkStart w:id="106" w:name="the-complete-software-analogy"/>
     <w:p>
       <w:pPr>
         <w:pStyle w:val="Heading2"/>
@@ -16469,8 +16959,8 @@
         </w:pict>
       </w:r>
     </w:p>
-    <w:bookmarkEnd w:id="101"/>
-    <w:bookmarkStart w:id="102" w:name="practical-implications"/>
+    <w:bookmarkEnd w:id="106"/>
+    <w:bookmarkStart w:id="107" w:name="practical-implications"/>
     <w:p>
       <w:pPr>
         <w:pStyle w:val="Heading2"/>
@@ -16582,8 +17072,8 @@
         </w:pict>
       </w:r>
     </w:p>
-    <w:bookmarkEnd w:id="102"/>
-    <w:bookmarkStart w:id="103" w:name="exercises-3"/>
+    <w:bookmarkEnd w:id="107"/>
+    <w:bookmarkStart w:id="108" w:name="exercises-3"/>
     <w:p>
       <w:pPr>
         <w:pStyle w:val="Heading2"/>
@@ -16659,8 +17149,8 @@
         </w:pict>
       </w:r>
     </w:p>
-    <w:bookmarkEnd w:id="103"/>
-    <w:bookmarkStart w:id="104" w:name="key-terms-3"/>
+    <w:bookmarkEnd w:id="108"/>
+    <w:bookmarkStart w:id="109" w:name="key-terms-3"/>
     <w:p>
       <w:pPr>
         <w:pStyle w:val="Heading2"/>
@@ -16906,8 +17396,8 @@
         </w:pict>
       </w:r>
     </w:p>
-    <w:bookmarkEnd w:id="104"/>
-    <w:bookmarkStart w:id="105" w:name="next-steps-3"/>
+    <w:bookmarkEnd w:id="109"/>
+    <w:bookmarkStart w:id="110" w:name="next-steps-3"/>
     <w:p>
       <w:pPr>
         <w:pStyle w:val="Heading2"/>
@@ -16979,9 +17469,9 @@
         <w:t xml:space="preserve">“The central dogma is a build pipeline. Debug it like one.”</w:t>
       </w:r>
     </w:p>
-    <w:bookmarkEnd w:id="105"/>
-    <w:bookmarkEnd w:id="106"/>
-    <w:bookmarkStart w:id="122" w:name="Xc7ed493cb851e770dccd403d163065196a5b3db"/>
+    <w:bookmarkEnd w:id="110"/>
+    <w:bookmarkEnd w:id="111"/>
+    <w:bookmarkStart w:id="127" w:name="Xc7ed493cb851e770dccd403d163065196a5b3db"/>
     <w:p>
       <w:pPr>
         <w:pStyle w:val="Heading1"/>
@@ -17087,7 +17577,7 @@
         </w:pict>
       </w:r>
     </w:p>
-    <w:bookmarkStart w:id="107" w:name="the-big-idea-4"/>
+    <w:bookmarkStart w:id="112" w:name="the-big-idea-4"/>
     <w:p>
       <w:pPr>
         <w:pStyle w:val="Heading2"/>
@@ -17339,8 +17829,8 @@
         <w:t xml:space="preserve">  └───────────────┘  └───────────────┘  └───────────────┘  └───────────────┘</w:t>
       </w:r>
     </w:p>
-    <w:bookmarkEnd w:id="107"/>
-    <w:bookmarkStart w:id="111" w:name="types-of-mutations-by-scale"/>
+    <w:bookmarkEnd w:id="112"/>
+    <w:bookmarkStart w:id="116" w:name="types-of-mutations-by-scale"/>
     <w:p>
       <w:pPr>
         <w:pStyle w:val="Heading2"/>
@@ -17349,7 +17839,7 @@
         <w:t xml:space="preserve">1. Types of Mutations by Scale</w:t>
       </w:r>
     </w:p>
-    <w:bookmarkStart w:id="108" w:name="single-nucleotide-variants-snvs"/>
+    <w:bookmarkStart w:id="113" w:name="single-nucleotide-variants-snvs"/>
     <w:p>
       <w:pPr>
         <w:pStyle w:val="Heading3"/>
@@ -17514,8 +18004,8 @@
         <w:t xml:space="preserve">(~2.1 for whole genome) is a standard QC metric for variant calls.</w:t>
       </w:r>
     </w:p>
-    <w:bookmarkEnd w:id="108"/>
-    <w:bookmarkStart w:id="109" w:name="insertions-and-deletions-indels"/>
+    <w:bookmarkEnd w:id="113"/>
+    <w:bookmarkStart w:id="114" w:name="insertions-and-deletions-indels"/>
     <w:p>
       <w:pPr>
         <w:pStyle w:val="Heading3"/>
@@ -17561,8 +18051,8 @@
         <w:t xml:space="preserve">Indels are harder to detect than SNVs because they shift the alignment.</w:t>
       </w:r>
     </w:p>
-    <w:bookmarkEnd w:id="109"/>
-    <w:bookmarkStart w:id="110" w:name="structural-variants-svs"/>
+    <w:bookmarkEnd w:id="114"/>
+    <w:bookmarkStart w:id="115" w:name="structural-variants-svs"/>
     <w:p>
       <w:pPr>
         <w:pStyle w:val="Heading3"/>
@@ -17741,9 +18231,9 @@
         </w:pict>
       </w:r>
     </w:p>
-    <w:bookmarkEnd w:id="110"/>
-    <w:bookmarkEnd w:id="111"/>
-    <w:bookmarkStart w:id="112" w:name="types-of-mutations-by-effect-on-protein"/>
+    <w:bookmarkEnd w:id="115"/>
+    <w:bookmarkEnd w:id="116"/>
+    <w:bookmarkStart w:id="117" w:name="types-of-mutations-by-effect-on-protein"/>
     <w:p>
       <w:pPr>
         <w:pStyle w:val="Heading2"/>
@@ -18288,8 +18778,8 @@
         </w:pict>
       </w:r>
     </w:p>
-    <w:bookmarkEnd w:id="112"/>
-    <w:bookmarkStart w:id="114" w:name="germline-vs-somatic-mutations"/>
+    <w:bookmarkEnd w:id="117"/>
+    <w:bookmarkStart w:id="119" w:name="germline-vs-somatic-mutations"/>
     <w:p>
       <w:pPr>
         <w:pStyle w:val="Heading2"/>
@@ -18431,7 +18921,7 @@
         <w:t xml:space="preserve">= runtime bug that only appears under specific conditions on one node</w:t>
       </w:r>
     </w:p>
-    <w:bookmarkStart w:id="113" w:name="clinical-impact"/>
+    <w:bookmarkStart w:id="118" w:name="clinical-impact"/>
     <w:p>
       <w:pPr>
         <w:pStyle w:val="Heading3"/>
@@ -18677,9 +19167,9 @@
         </w:pict>
       </w:r>
     </w:p>
-    <w:bookmarkEnd w:id="113"/>
-    <w:bookmarkEnd w:id="114"/>
-    <w:bookmarkStart w:id="115" w:name="hardy-weinberg-principle"/>
+    <w:bookmarkEnd w:id="118"/>
+    <w:bookmarkEnd w:id="119"/>
+    <w:bookmarkStart w:id="120" w:name="hardy-weinberg-principle"/>
     <w:p>
       <w:pPr>
         <w:pStyle w:val="Heading2"/>
@@ -18881,8 +19371,8 @@
         </w:pict>
       </w:r>
     </w:p>
-    <w:bookmarkEnd w:id="115"/>
-    <w:bookmarkStart w:id="116" w:name="dbsnp-and-variant-databases"/>
+    <w:bookmarkEnd w:id="120"/>
+    <w:bookmarkStart w:id="121" w:name="dbsnp-and-variant-databases"/>
     <w:p>
       <w:pPr>
         <w:pStyle w:val="Heading2"/>
@@ -19239,8 +19729,8 @@
         </w:pict>
       </w:r>
     </w:p>
-    <w:bookmarkEnd w:id="116"/>
-    <w:bookmarkStart w:id="117" w:name="zygosity-and-genotype-encoding"/>
+    <w:bookmarkEnd w:id="121"/>
+    <w:bookmarkStart w:id="122" w:name="zygosity-and-genotype-encoding"/>
     <w:p>
       <w:pPr>
         <w:pStyle w:val="Heading2"/>
@@ -19590,8 +20080,8 @@
         </w:pict>
       </w:r>
     </w:p>
-    <w:bookmarkEnd w:id="117"/>
-    <w:bookmarkStart w:id="118" w:name="practical-mutation-analysis-commands"/>
+    <w:bookmarkEnd w:id="122"/>
+    <w:bookmarkStart w:id="123" w:name="practical-mutation-analysis-commands"/>
     <w:p>
       <w:pPr>
         <w:pStyle w:val="Heading2"/>
@@ -19810,8 +20300,8 @@
         </w:pict>
       </w:r>
     </w:p>
-    <w:bookmarkEnd w:id="118"/>
-    <w:bookmarkStart w:id="119" w:name="exercises-4"/>
+    <w:bookmarkEnd w:id="123"/>
+    <w:bookmarkStart w:id="124" w:name="exercises-4"/>
     <w:p>
       <w:pPr>
         <w:pStyle w:val="Heading2"/>
@@ -19875,8 +20365,8 @@
         </w:pict>
       </w:r>
     </w:p>
-    <w:bookmarkEnd w:id="119"/>
-    <w:bookmarkStart w:id="120" w:name="key-terms-4"/>
+    <w:bookmarkEnd w:id="124"/>
+    <w:bookmarkStart w:id="125" w:name="key-terms-4"/>
     <w:p>
       <w:pPr>
         <w:pStyle w:val="Heading2"/>
@@ -20218,8 +20708,8 @@
         </w:pict>
       </w:r>
     </w:p>
-    <w:bookmarkEnd w:id="120"/>
-    <w:bookmarkStart w:id="121" w:name="next-steps-4"/>
+    <w:bookmarkEnd w:id="125"/>
+    <w:bookmarkStart w:id="126" w:name="next-steps-4"/>
     <w:p>
       <w:pPr>
         <w:pStyle w:val="Heading2"/>
@@ -20312,9 +20802,9 @@
         <w:t xml:space="preserve">“A mutation is just a git diff — but the consequences can be more serious than a merge conflict.”</w:t>
       </w:r>
     </w:p>
-    <w:bookmarkEnd w:id="121"/>
-    <w:bookmarkEnd w:id="122"/>
-    <w:bookmarkStart w:id="148" w:name="sequencing-technology-how-we-read-dna"/>
+    <w:bookmarkEnd w:id="126"/>
+    <w:bookmarkEnd w:id="127"/>
+    <w:bookmarkStart w:id="153" w:name="sequencing-technology-how-we-read-dna"/>
     <w:p>
       <w:pPr>
         <w:pStyle w:val="Heading1"/>
@@ -20420,7 +20910,7 @@
         </w:pict>
       </w:r>
     </w:p>
-    <w:bookmarkStart w:id="123" w:name="the-big-idea-5"/>
+    <w:bookmarkStart w:id="128" w:name="the-big-idea-5"/>
     <w:p>
       <w:pPr>
         <w:pStyle w:val="Heading2"/>
@@ -20468,8 +20958,8 @@
         </w:pict>
       </w:r>
     </w:p>
-    <w:bookmarkEnd w:id="123"/>
-    <w:bookmarkStart w:id="124" w:name="three-generations-of-sequencing"/>
+    <w:bookmarkEnd w:id="128"/>
+    <w:bookmarkStart w:id="129" w:name="three-generations-of-sequencing"/>
     <w:p>
       <w:pPr>
         <w:pStyle w:val="Heading2"/>
@@ -20743,8 +21233,8 @@
         </w:pict>
       </w:r>
     </w:p>
-    <w:bookmarkEnd w:id="124"/>
-    <w:bookmarkStart w:id="129" w:name="X7c88601a58a2ac690c6787704cecccc7b4fe7d1"/>
+    <w:bookmarkEnd w:id="129"/>
+    <w:bookmarkStart w:id="134" w:name="X7c88601a58a2ac690c6787704cecccc7b4fe7d1"/>
     <w:p>
       <w:pPr>
         <w:pStyle w:val="Heading2"/>
@@ -20868,7 +21358,7 @@
         <w:t xml:space="preserve">           (Millions of clusters per lane)</w:t>
       </w:r>
     </w:p>
-    <w:bookmarkStart w:id="125" w:name="how-it-works"/>
+    <w:bookmarkStart w:id="130" w:name="how-it-works"/>
     <w:p>
       <w:pPr>
         <w:pStyle w:val="Heading3"/>
@@ -21005,8 +21495,8 @@
         <w:t xml:space="preserve">  - Output: FASTQ (sequences + quality scores)</w:t>
       </w:r>
     </w:p>
-    <w:bookmarkEnd w:id="125"/>
-    <w:bookmarkStart w:id="126" w:name="illumina-platform-comparison"/>
+    <w:bookmarkEnd w:id="130"/>
+    <w:bookmarkStart w:id="131" w:name="illumina-platform-comparison"/>
     <w:p>
       <w:pPr>
         <w:pStyle w:val="Heading3"/>
@@ -21374,8 +21864,8 @@
         </w:tc>
       </w:tr>
     </w:tbl>
-    <w:bookmarkEnd w:id="126"/>
-    <w:bookmarkStart w:id="127" w:name="key-concepts-for-illumina"/>
+    <w:bookmarkEnd w:id="131"/>
+    <w:bookmarkStart w:id="132" w:name="key-concepts-for-illumina"/>
     <w:p>
       <w:pPr>
         <w:pStyle w:val="Heading3"/>
@@ -21541,8 +22031,8 @@
         <w:t xml:space="preserve">= the distance between the two reads. For a 350 bp insert with 2×150 reads, the gap between reads is 50 bp.</w:t>
       </w:r>
     </w:p>
-    <w:bookmarkEnd w:id="127"/>
-    <w:bookmarkStart w:id="128" w:name="illumina-error-profile"/>
+    <w:bookmarkEnd w:id="132"/>
+    <w:bookmarkStart w:id="133" w:name="illumina-error-profile"/>
     <w:p>
       <w:pPr>
         <w:pStyle w:val="Heading3"/>
@@ -21616,9 +22106,9 @@
         </w:pict>
       </w:r>
     </w:p>
-    <w:bookmarkEnd w:id="128"/>
-    <w:bookmarkEnd w:id="129"/>
-    <w:bookmarkStart w:id="134" w:name="oxford-nanopore-long-read"/>
+    <w:bookmarkEnd w:id="133"/>
+    <w:bookmarkEnd w:id="134"/>
+    <w:bookmarkStart w:id="139" w:name="oxford-nanopore-long-read"/>
     <w:p>
       <w:pPr>
         <w:pStyle w:val="Heading2"/>
@@ -21635,7 +22125,7 @@
         <w:t xml:space="preserve">Nanopore sequences single molecules in real time.</w:t>
       </w:r>
     </w:p>
-    <w:bookmarkStart w:id="130" w:name="how-it-works-1"/>
+    <w:bookmarkStart w:id="135" w:name="how-it-works-1"/>
     <w:p>
       <w:pPr>
         <w:pStyle w:val="Heading3"/>
@@ -21840,8 +22330,8 @@
         <w:t xml:space="preserve">Key: Real-time, ultra-long reads, portable (MinION)</w:t>
       </w:r>
     </w:p>
-    <w:bookmarkEnd w:id="130"/>
-    <w:bookmarkStart w:id="131" w:name="key-characteristics"/>
+    <w:bookmarkEnd w:id="135"/>
+    <w:bookmarkStart w:id="136" w:name="key-characteristics"/>
     <w:p>
       <w:pPr>
         <w:pStyle w:val="Heading3"/>
@@ -21888,8 +22378,8 @@
         <w:t xml:space="preserve">Base calling: Done in real time by neural networks (Guppy, Dorado)</w:t>
       </w:r>
     </w:p>
-    <w:bookmarkEnd w:id="131"/>
-    <w:bookmarkStart w:id="132" w:name="why-long-reads-matter"/>
+    <w:bookmarkEnd w:id="136"/>
+    <w:bookmarkStart w:id="137" w:name="why-long-reads-matter"/>
     <w:p>
       <w:pPr>
         <w:pStyle w:val="Heading3"/>
@@ -22015,8 +22505,8 @@
         <w:t xml:space="preserve">                                                    ↑ unambiguous</w:t>
       </w:r>
     </w:p>
-    <w:bookmarkEnd w:id="132"/>
-    <w:bookmarkStart w:id="133" w:name="nanopore-error-profile"/>
+    <w:bookmarkEnd w:id="137"/>
+    <w:bookmarkStart w:id="138" w:name="nanopore-error-profile"/>
     <w:p>
       <w:pPr>
         <w:pStyle w:val="Heading3"/>
@@ -22068,9 +22558,9 @@
         </w:pict>
       </w:r>
     </w:p>
-    <w:bookmarkEnd w:id="133"/>
-    <w:bookmarkEnd w:id="134"/>
-    <w:bookmarkStart w:id="137" w:name="pacbio-hifi-long-read-high-accuracy"/>
+    <w:bookmarkEnd w:id="138"/>
+    <w:bookmarkEnd w:id="139"/>
+    <w:bookmarkStart w:id="142" w:name="pacbio-hifi-long-read-high-accuracy"/>
     <w:p>
       <w:pPr>
         <w:pStyle w:val="Heading2"/>
@@ -22096,7 +22586,7 @@
         <w:t xml:space="preserve">: long reads with Illumina-quality accuracy.</w:t>
       </w:r>
     </w:p>
-    <w:bookmarkStart w:id="135" w:name="how-it-works-2"/>
+    <w:bookmarkStart w:id="140" w:name="how-it-works-2"/>
     <w:p>
       <w:pPr>
         <w:pStyle w:val="Heading3"/>
@@ -22199,8 +22689,8 @@
         <w:t xml:space="preserve">CCS:     ACTTGCTAA  ← final, high-quality</w:t>
       </w:r>
     </w:p>
-    <w:bookmarkEnd w:id="135"/>
-    <w:bookmarkStart w:id="136" w:name="comparison"/>
+    <w:bookmarkEnd w:id="140"/>
+    <w:bookmarkStart w:id="141" w:name="comparison"/>
     <w:p>
       <w:pPr>
         <w:pStyle w:val="Heading3"/>
@@ -22522,9 +23012,9 @@
         </w:pict>
       </w:r>
     </w:p>
-    <w:bookmarkEnd w:id="136"/>
-    <w:bookmarkEnd w:id="137"/>
-    <w:bookmarkStart w:id="140" w:name="the-sequencing-pipeline-high-level"/>
+    <w:bookmarkEnd w:id="141"/>
+    <w:bookmarkEnd w:id="142"/>
+    <w:bookmarkStart w:id="145" w:name="the-sequencing-pipeline-high-level"/>
     <w:p>
       <w:pPr>
         <w:pStyle w:val="Heading2"/>
@@ -22544,7 +23034,7 @@
         <w:t xml:space="preserve">Sample → DNA extraction → Library prep → Sequencer → Base calling → FASTQ</w:t>
       </w:r>
     </w:p>
-    <w:bookmarkStart w:id="138" w:name="library-preparation"/>
+    <w:bookmarkStart w:id="143" w:name="library-preparation"/>
     <w:p>
       <w:pPr>
         <w:pStyle w:val="Heading3"/>
@@ -22675,8 +23165,8 @@
         <w:t xml:space="preserve">)</w:t>
       </w:r>
     </w:p>
-    <w:bookmarkEnd w:id="138"/>
-    <w:bookmarkStart w:id="139" w:name="multiplexing"/>
+    <w:bookmarkEnd w:id="143"/>
+    <w:bookmarkStart w:id="144" w:name="multiplexing"/>
     <w:p>
       <w:pPr>
         <w:pStyle w:val="Heading3"/>
@@ -22748,9 +23238,9 @@
         </w:pict>
       </w:r>
     </w:p>
-    <w:bookmarkEnd w:id="139"/>
-    <w:bookmarkEnd w:id="140"/>
-    <w:bookmarkStart w:id="144" w:name="Xb5af2f67ad204cbac1f07a3e6f35c29e7c46cfd"/>
+    <w:bookmarkEnd w:id="144"/>
+    <w:bookmarkEnd w:id="145"/>
+    <w:bookmarkStart w:id="149" w:name="Xb5af2f67ad204cbac1f07a3e6f35c29e7c46cfd"/>
     <w:p>
       <w:pPr>
         <w:pStyle w:val="Heading2"/>
@@ -22759,7 +23249,7 @@
         <w:t xml:space="preserve">6. Practical Considerations for Platform Engineers</w:t>
       </w:r>
     </w:p>
-    <w:bookmarkStart w:id="141" w:name="storage-requirements"/>
+    <w:bookmarkStart w:id="146" w:name="storage-requirements"/>
     <w:p>
       <w:pPr>
         <w:pStyle w:val="Heading3"/>
@@ -22926,8 +23416,8 @@
         </w:tc>
       </w:tr>
     </w:tbl>
-    <w:bookmarkEnd w:id="141"/>
-    <w:bookmarkStart w:id="142" w:name="compute-requirements"/>
+    <w:bookmarkEnd w:id="146"/>
+    <w:bookmarkStart w:id="147" w:name="compute-requirements"/>
     <w:p>
       <w:pPr>
         <w:pStyle w:val="Heading3"/>
@@ -22974,8 +23464,8 @@
         <w:t xml:space="preserve">  Total: ~100 GB RAM peak (some tools)</w:t>
       </w:r>
     </w:p>
-    <w:bookmarkEnd w:id="142"/>
-    <w:bookmarkStart w:id="143" w:name="cost-examples"/>
+    <w:bookmarkEnd w:id="147"/>
+    <w:bookmarkStart w:id="148" w:name="cost-examples"/>
     <w:p>
       <w:pPr>
         <w:pStyle w:val="Heading3"/>
@@ -23038,9 +23528,9 @@
         </w:pict>
       </w:r>
     </w:p>
-    <w:bookmarkEnd w:id="143"/>
-    <w:bookmarkEnd w:id="144"/>
-    <w:bookmarkStart w:id="145" w:name="exercises-5"/>
+    <w:bookmarkEnd w:id="148"/>
+    <w:bookmarkEnd w:id="149"/>
+    <w:bookmarkStart w:id="150" w:name="exercises-5"/>
     <w:p>
       <w:pPr>
         <w:pStyle w:val="Heading2"/>
@@ -23104,8 +23594,8 @@
         </w:pict>
       </w:r>
     </w:p>
-    <w:bookmarkEnd w:id="145"/>
-    <w:bookmarkStart w:id="146" w:name="key-terms-5"/>
+    <w:bookmarkEnd w:id="150"/>
+    <w:bookmarkStart w:id="151" w:name="key-terms-5"/>
     <w:p>
       <w:pPr>
         <w:pStyle w:val="Heading2"/>
@@ -23400,8 +23890,8 @@
         </w:pict>
       </w:r>
     </w:p>
-    <w:bookmarkEnd w:id="146"/>
-    <w:bookmarkStart w:id="147" w:name="next-steps-5"/>
+    <w:bookmarkEnd w:id="151"/>
+    <w:bookmarkStart w:id="152" w:name="next-steps-5"/>
     <w:p>
       <w:pPr>
         <w:pStyle w:val="Heading2"/>
@@ -23494,9 +23984,9 @@
         <w:t xml:space="preserve">“A sequencer is a camera that takes pictures of chemistry. The base caller is the OCR.”</w:t>
       </w:r>
     </w:p>
-    <w:bookmarkEnd w:id="147"/>
-    <w:bookmarkEnd w:id="148"/>
-    <w:bookmarkStart w:id="170" w:name="read-lengths-sequencing-coverage"/>
+    <w:bookmarkEnd w:id="152"/>
+    <w:bookmarkEnd w:id="153"/>
+    <w:bookmarkStart w:id="175" w:name="read-lengths-sequencing-coverage"/>
     <w:p>
       <w:pPr>
         <w:pStyle w:val="Heading1"/>
@@ -23566,7 +24056,7 @@
         </w:pict>
       </w:r>
     </w:p>
-    <w:bookmarkStart w:id="149" w:name="the-big-idea-6"/>
+    <w:bookmarkStart w:id="154" w:name="the-big-idea-6"/>
     <w:p>
       <w:pPr>
         <w:pStyle w:val="Heading2"/>
@@ -23644,8 +24134,8 @@
         </w:pict>
       </w:r>
     </w:p>
-    <w:bookmarkEnd w:id="149"/>
-    <w:bookmarkStart w:id="153" w:name="read-length"/>
+    <w:bookmarkEnd w:id="154"/>
+    <w:bookmarkStart w:id="158" w:name="read-length"/>
     <w:p>
       <w:pPr>
         <w:pStyle w:val="Heading2"/>
@@ -23689,7 +24179,7 @@
         <w:t xml:space="preserve">Read length (bp) = number of bases reported</w:t>
       </w:r>
     </w:p>
-    <w:bookmarkStart w:id="150" w:name="examples"/>
+    <w:bookmarkStart w:id="155" w:name="examples"/>
     <w:p>
       <w:pPr>
         <w:pStyle w:val="Heading3"/>
@@ -23923,8 +24413,8 @@
         </w:tc>
       </w:tr>
     </w:tbl>
-    <w:bookmarkEnd w:id="150"/>
-    <w:bookmarkStart w:id="151" w:name="why-read-length-matters"/>
+    <w:bookmarkEnd w:id="155"/>
+    <w:bookmarkStart w:id="156" w:name="why-read-length-matters"/>
     <w:p>
       <w:pPr>
         <w:pStyle w:val="Heading3"/>
@@ -24137,8 +24627,8 @@
         <w:t xml:space="preserve">Transcript isoform detection (Iso-Seq)</w:t>
       </w:r>
     </w:p>
-    <w:bookmarkEnd w:id="151"/>
-    <w:bookmarkStart w:id="152" w:name="the-mappability-problem"/>
+    <w:bookmarkEnd w:id="156"/>
+    <w:bookmarkStart w:id="157" w:name="the-mappability-problem"/>
     <w:p>
       <w:pPr>
         <w:pStyle w:val="Heading3"/>
@@ -24215,9 +24705,9 @@
         </w:pict>
       </w:r>
     </w:p>
-    <w:bookmarkEnd w:id="152"/>
-    <w:bookmarkEnd w:id="153"/>
-    <w:bookmarkStart w:id="158" w:name="coverage-depth"/>
+    <w:bookmarkEnd w:id="157"/>
+    <w:bookmarkEnd w:id="158"/>
+    <w:bookmarkStart w:id="163" w:name="coverage-depth"/>
     <w:p>
       <w:pPr>
         <w:pStyle w:val="Heading2"/>
@@ -24276,7 +24766,7 @@
         <w:t xml:space="preserve">  90 Gb sequenced ÷ 3 Gb human genome = 30× coverage</w:t>
       </w:r>
     </w:p>
-    <w:bookmarkStart w:id="154" w:name="coverage-naming"/>
+    <w:bookmarkStart w:id="159" w:name="coverage-naming"/>
     <w:p>
       <w:pPr>
         <w:pStyle w:val="Heading3"/>
@@ -24510,8 +25000,8 @@
         </w:tc>
       </w:tr>
     </w:tbl>
-    <w:bookmarkEnd w:id="154"/>
-    <w:bookmarkStart w:id="155" w:name="coverage-distribution"/>
+    <w:bookmarkEnd w:id="159"/>
+    <w:bookmarkStart w:id="160" w:name="coverage-distribution"/>
     <w:p>
       <w:pPr>
         <w:pStyle w:val="Heading3"/>
@@ -24912,8 +25402,8 @@
         <w:t xml:space="preserve"> 30     0.000   0.000   0.073</w:t>
       </w:r>
     </w:p>
-    <w:bookmarkEnd w:id="155"/>
-    <w:bookmarkStart w:id="156" w:name="the-lander-waterman-model"/>
+    <w:bookmarkEnd w:id="160"/>
+    <w:bookmarkStart w:id="161" w:name="the-lander-waterman-model"/>
     <w:p>
       <w:pPr>
         <w:pStyle w:val="Heading3"/>
@@ -25362,8 +25852,8 @@
         <w:t xml:space="preserve"># ~0.00003</w:t>
       </w:r>
     </w:p>
-    <w:bookmarkEnd w:id="156"/>
-    <w:bookmarkStart w:id="157" w:name="why-30"/>
+    <w:bookmarkEnd w:id="161"/>
+    <w:bookmarkStart w:id="162" w:name="why-30"/>
     <w:p>
       <w:pPr>
         <w:pStyle w:val="Heading3"/>
@@ -25423,9 +25913,9 @@
         </w:pict>
       </w:r>
     </w:p>
-    <w:bookmarkEnd w:id="157"/>
-    <w:bookmarkEnd w:id="158"/>
-    <w:bookmarkStart w:id="162" w:name="coverage-and-variant-detection"/>
+    <w:bookmarkEnd w:id="162"/>
+    <w:bookmarkEnd w:id="163"/>
+    <w:bookmarkStart w:id="167" w:name="coverage-and-variant-detection"/>
     <w:p>
       <w:pPr>
         <w:pStyle w:val="Heading2"/>
@@ -25434,7 +25924,7 @@
         <w:t xml:space="preserve">3. Coverage and Variant Detection</w:t>
       </w:r>
     </w:p>
-    <w:bookmarkStart w:id="159" w:name="minimum-coverage-for-variant-calling"/>
+    <w:bookmarkStart w:id="164" w:name="minimum-coverage-for-variant-calling"/>
     <w:p>
       <w:pPr>
         <w:pStyle w:val="Heading3"/>
@@ -25472,8 +25962,8 @@
         <w:t xml:space="preserve">Somatic (VAF ~0.05–0.3):           need ≥50–100× depth</w:t>
       </w:r>
     </w:p>
-    <w:bookmarkEnd w:id="159"/>
-    <w:bookmarkStart w:id="160" w:name="depth-vs-allele-frequency-detection"/>
+    <w:bookmarkEnd w:id="164"/>
+    <w:bookmarkStart w:id="165" w:name="depth-vs-allele-frequency-detection"/>
     <w:p>
       <w:pPr>
         <w:pStyle w:val="Heading3"/>
@@ -25511,8 +26001,8 @@
         <w:t xml:space="preserve">  For VAF 0.05 (typical liquid biopsy): need ≥500×</w:t>
       </w:r>
     </w:p>
-    <w:bookmarkEnd w:id="160"/>
-    <w:bookmarkStart w:id="161" w:name="coverage-impact-on-genotype-quality"/>
+    <w:bookmarkEnd w:id="165"/>
+    <w:bookmarkStart w:id="166" w:name="coverage-impact-on-genotype-quality"/>
     <w:p>
       <w:pPr>
         <w:pStyle w:val="Heading3"/>
@@ -25938,9 +26428,9 @@
         </w:pict>
       </w:r>
     </w:p>
-    <w:bookmarkEnd w:id="161"/>
-    <w:bookmarkEnd w:id="162"/>
-    <w:bookmarkStart w:id="164" w:name="coverage-and-sequencing-cost"/>
+    <w:bookmarkEnd w:id="166"/>
+    <w:bookmarkEnd w:id="167"/>
+    <w:bookmarkStart w:id="169" w:name="coverage-and-sequencing-cost"/>
     <w:p>
       <w:pPr>
         <w:pStyle w:val="Heading2"/>
@@ -25999,7 +26489,7 @@
         <w:t xml:space="preserve">  60× (deep):       400 GB      120 GB      $1,200–2,000</w:t>
       </w:r>
     </w:p>
-    <w:bookmarkStart w:id="163" w:name="coverage-downsampling"/>
+    <w:bookmarkStart w:id="168" w:name="coverage-downsampling"/>
     <w:p>
       <w:pPr>
         <w:pStyle w:val="Heading3"/>
@@ -26085,9 +26575,9 @@
         </w:pict>
       </w:r>
     </w:p>
-    <w:bookmarkEnd w:id="163"/>
-    <w:bookmarkEnd w:id="164"/>
-    <w:bookmarkStart w:id="165" w:name="practical-coverage-commands"/>
+    <w:bookmarkEnd w:id="168"/>
+    <w:bookmarkEnd w:id="169"/>
+    <w:bookmarkStart w:id="170" w:name="practical-coverage-commands"/>
     <w:p>
       <w:pPr>
         <w:pStyle w:val="Heading2"/>
@@ -26480,8 +26970,8 @@
         </w:pict>
       </w:r>
     </w:p>
-    <w:bookmarkEnd w:id="165"/>
-    <w:bookmarkStart w:id="166" w:name="insert-size-paired-end"/>
+    <w:bookmarkEnd w:id="170"/>
+    <w:bookmarkStart w:id="171" w:name="insert-size-paired-end"/>
     <w:p>
       <w:pPr>
         <w:pStyle w:val="Heading2"/>
@@ -26761,8 +27251,8 @@
         </w:pict>
       </w:r>
     </w:p>
-    <w:bookmarkEnd w:id="166"/>
-    <w:bookmarkStart w:id="167" w:name="exercises-6"/>
+    <w:bookmarkEnd w:id="171"/>
+    <w:bookmarkStart w:id="172" w:name="exercises-6"/>
     <w:p>
       <w:pPr>
         <w:pStyle w:val="Heading2"/>
@@ -26854,8 +27344,8 @@
         </w:pict>
       </w:r>
     </w:p>
-    <w:bookmarkEnd w:id="167"/>
-    <w:bookmarkStart w:id="168" w:name="key-terms-6"/>
+    <w:bookmarkEnd w:id="172"/>
+    <w:bookmarkStart w:id="173" w:name="key-terms-6"/>
     <w:p>
       <w:pPr>
         <w:pStyle w:val="Heading2"/>
@@ -27077,8 +27567,8 @@
         </w:pict>
       </w:r>
     </w:p>
-    <w:bookmarkEnd w:id="168"/>
-    <w:bookmarkStart w:id="169" w:name="next-steps-6"/>
+    <w:bookmarkEnd w:id="173"/>
+    <w:bookmarkStart w:id="174" w:name="next-steps-6"/>
     <w:p>
       <w:pPr>
         <w:pStyle w:val="Heading2"/>
@@ -27150,9 +27640,9 @@
         <w:t xml:space="preserve">“Coverage is like sample size in a survey — more is almost always better, but the cost curve is exponential.”</w:t>
       </w:r>
     </w:p>
-    <w:bookmarkEnd w:id="169"/>
-    <w:bookmarkEnd w:id="170"/>
-    <w:bookmarkStart w:id="191" w:name="X0d90b50f903542da082ade4f073fc78a604de8d"/>
+    <w:bookmarkEnd w:id="174"/>
+    <w:bookmarkEnd w:id="175"/>
+    <w:bookmarkStart w:id="196" w:name="X0d90b50f903542da082ade4f073fc78a604de8d"/>
     <w:p>
       <w:pPr>
         <w:pStyle w:val="Heading1"/>
@@ -27234,7 +27724,7 @@
         </w:pict>
       </w:r>
     </w:p>
-    <w:bookmarkStart w:id="171" w:name="the-big-idea-7"/>
+    <w:bookmarkStart w:id="176" w:name="the-big-idea-7"/>
     <w:p>
       <w:pPr>
         <w:pStyle w:val="Heading2"/>
@@ -27342,8 +27832,8 @@
         </w:pict>
       </w:r>
     </w:p>
-    <w:bookmarkEnd w:id="171"/>
-    <w:bookmarkStart w:id="172" w:name="the-alignment-problem"/>
+    <w:bookmarkEnd w:id="176"/>
+    <w:bookmarkStart w:id="177" w:name="the-alignment-problem"/>
     <w:p>
       <w:pPr>
         <w:pStyle w:val="Heading2"/>
@@ -27547,8 +28037,8 @@
         </w:pict>
       </w:r>
     </w:p>
-    <w:bookmarkEnd w:id="172"/>
-    <w:bookmarkStart w:id="177" w:name="alignment-algorithms"/>
+    <w:bookmarkEnd w:id="177"/>
+    <w:bookmarkStart w:id="182" w:name="alignment-algorithms"/>
     <w:p>
       <w:pPr>
         <w:pStyle w:val="Heading2"/>
@@ -27557,7 +28047,7 @@
         <w:t xml:space="preserve">2. Alignment Algorithms</w:t>
       </w:r>
     </w:p>
-    <w:bookmarkStart w:id="173" w:name="brute-force"/>
+    <w:bookmarkStart w:id="178" w:name="brute-force"/>
     <w:p>
       <w:pPr>
         <w:pStyle w:val="Heading3"/>
@@ -28003,8 +28493,8 @@
         <w:t xml:space="preserve">.</w:t>
       </w:r>
     </w:p>
-    <w:bookmarkEnd w:id="173"/>
-    <w:bookmarkStart w:id="174" w:name="X87e1614441dfc762b398fb6107496e40e395d75"/>
+    <w:bookmarkEnd w:id="178"/>
+    <w:bookmarkStart w:id="179" w:name="X87e1614441dfc762b398fb6107496e40e395d75"/>
     <w:p>
       <w:pPr>
         <w:pStyle w:val="Heading3"/>
@@ -28204,8 +28694,8 @@
         <w:t xml:space="preserve">  Seed 2: extended → full match, best alignment       ✓</w:t>
       </w:r>
     </w:p>
-    <w:bookmarkEnd w:id="174"/>
-    <w:bookmarkStart w:id="175" w:name="seed-and-extend"/>
+    <w:bookmarkEnd w:id="179"/>
+    <w:bookmarkStart w:id="180" w:name="seed-and-extend"/>
     <w:p>
       <w:pPr>
         <w:pStyle w:val="Heading3"/>
@@ -28307,8 +28797,8 @@
         <w:t xml:space="preserve">         ACTGACTGACTG  → full alignment</w:t>
       </w:r>
     </w:p>
-    <w:bookmarkEnd w:id="175"/>
-    <w:bookmarkStart w:id="176" w:name="minimizer-sketching"/>
+    <w:bookmarkEnd w:id="180"/>
+    <w:bookmarkStart w:id="181" w:name="minimizer-sketching"/>
     <w:p>
       <w:pPr>
         <w:pStyle w:val="Heading3"/>
@@ -28370,9 +28860,9 @@
         </w:pict>
       </w:r>
     </w:p>
-    <w:bookmarkEnd w:id="176"/>
-    <w:bookmarkEnd w:id="177"/>
-    <w:bookmarkStart w:id="179" w:name="scoring-alignments"/>
+    <w:bookmarkEnd w:id="181"/>
+    <w:bookmarkEnd w:id="182"/>
+    <w:bookmarkStart w:id="184" w:name="scoring-alignments"/>
     <w:p>
       <w:pPr>
         <w:pStyle w:val="Heading2"/>
@@ -28685,7 +29175,7 @@
         <w:t xml:space="preserve">Optimal local alignment: ACTGAC vs ACTGAC (score = 6)</w:t>
       </w:r>
     </w:p>
-    <w:bookmarkStart w:id="178" w:name="the-smith-waterman-algorithm"/>
+    <w:bookmarkStart w:id="183" w:name="the-smith-waterman-algorithm"/>
     <w:p>
       <w:pPr>
         <w:pStyle w:val="Heading3"/>
@@ -28800,9 +29290,9 @@
         </w:pict>
       </w:r>
     </w:p>
-    <w:bookmarkEnd w:id="178"/>
-    <w:bookmarkEnd w:id="179"/>
-    <w:bookmarkStart w:id="180" w:name="the-cigar-string"/>
+    <w:bookmarkEnd w:id="183"/>
+    <w:bookmarkEnd w:id="184"/>
+    <w:bookmarkStart w:id="185" w:name="the-cigar-string"/>
     <w:p>
       <w:pPr>
         <w:pStyle w:val="Heading2"/>
@@ -29192,8 +29682,8 @@
         </w:pict>
       </w:r>
     </w:p>
-    <w:bookmarkEnd w:id="180"/>
-    <w:bookmarkStart w:id="181" w:name="alignment-flags-sam-flag"/>
+    <w:bookmarkEnd w:id="185"/>
+    <w:bookmarkStart w:id="186" w:name="alignment-flags-sam-flag"/>
     <w:p>
       <w:pPr>
         <w:pStyle w:val="Heading2"/>
@@ -30139,8 +30629,8 @@
         </w:pict>
       </w:r>
     </w:p>
-    <w:bookmarkEnd w:id="181"/>
-    <w:bookmarkStart w:id="183" w:name="popular-aligners"/>
+    <w:bookmarkEnd w:id="186"/>
+    <w:bookmarkStart w:id="188" w:name="popular-aligners"/>
     <w:p>
       <w:pPr>
         <w:pStyle w:val="Heading2"/>
@@ -30542,7 +31032,7 @@
         </w:tc>
       </w:tr>
     </w:tbl>
-    <w:bookmarkStart w:id="182" w:name="how-to-run-alignments"/>
+    <w:bookmarkStart w:id="187" w:name="how-to-run-alignments"/>
     <w:p>
       <w:pPr>
         <w:pStyle w:val="Heading3"/>
@@ -30770,9 +31260,9 @@
         </w:pict>
       </w:r>
     </w:p>
-    <w:bookmarkEnd w:id="182"/>
-    <w:bookmarkEnd w:id="183"/>
-    <w:bookmarkStart w:id="185" w:name="reference-genomes"/>
+    <w:bookmarkEnd w:id="187"/>
+    <w:bookmarkEnd w:id="188"/>
+    <w:bookmarkStart w:id="190" w:name="reference-genomes"/>
     <w:p>
       <w:pPr>
         <w:pStyle w:val="Heading2"/>
@@ -30869,7 +31359,7 @@
         <w:t xml:space="preserve"> faidx hg38.fa</w:t>
       </w:r>
     </w:p>
-    <w:bookmarkStart w:id="184" w:name="reference-genome-files"/>
+    <w:bookmarkStart w:id="189" w:name="reference-genome-files"/>
     <w:p>
       <w:pPr>
         <w:pStyle w:val="Heading3"/>
@@ -30923,9 +31413,9 @@
         </w:pict>
       </w:r>
     </w:p>
-    <w:bookmarkEnd w:id="184"/>
-    <w:bookmarkEnd w:id="185"/>
-    <w:bookmarkStart w:id="186" w:name="why-alignment-matters"/>
+    <w:bookmarkEnd w:id="189"/>
+    <w:bookmarkEnd w:id="190"/>
+    <w:bookmarkStart w:id="191" w:name="why-alignment-matters"/>
     <w:p>
       <w:pPr>
         <w:pStyle w:val="Heading2"/>
@@ -31030,8 +31520,8 @@
         </w:pict>
       </w:r>
     </w:p>
-    <w:bookmarkEnd w:id="186"/>
-    <w:bookmarkStart w:id="187" w:name="alignment-statistics"/>
+    <w:bookmarkEnd w:id="191"/>
+    <w:bookmarkStart w:id="192" w:name="alignment-statistics"/>
     <w:p>
       <w:pPr>
         <w:pStyle w:val="Heading2"/>
@@ -31499,8 +31989,8 @@
         </w:pict>
       </w:r>
     </w:p>
-    <w:bookmarkEnd w:id="187"/>
-    <w:bookmarkStart w:id="188" w:name="exercises-7"/>
+    <w:bookmarkEnd w:id="192"/>
+    <w:bookmarkStart w:id="193" w:name="exercises-7"/>
     <w:p>
       <w:pPr>
         <w:pStyle w:val="Heading2"/>
@@ -31619,8 +32109,8 @@
         </w:pict>
       </w:r>
     </w:p>
-    <w:bookmarkEnd w:id="188"/>
-    <w:bookmarkStart w:id="189" w:name="key-terms-7"/>
+    <w:bookmarkEnd w:id="193"/>
+    <w:bookmarkStart w:id="194" w:name="key-terms-7"/>
     <w:p>
       <w:pPr>
         <w:pStyle w:val="Heading2"/>
@@ -31891,8 +32381,8 @@
         </w:pict>
       </w:r>
     </w:p>
-    <w:bookmarkEnd w:id="189"/>
-    <w:bookmarkStart w:id="190" w:name="next-steps-7"/>
+    <w:bookmarkEnd w:id="194"/>
+    <w:bookmarkStart w:id="195" w:name="next-steps-7"/>
     <w:p>
       <w:pPr>
         <w:pStyle w:val="Heading2"/>
@@ -32013,9 +32503,9 @@
         <w:t xml:space="preserve">The CIGAR string is the evidence.”</w:t>
       </w:r>
     </w:p>
-    <w:bookmarkEnd w:id="190"/>
-    <w:bookmarkEnd w:id="191"/>
-    <w:bookmarkStart w:id="209" w:name="quality-scores-the-phred-system"/>
+    <w:bookmarkEnd w:id="195"/>
+    <w:bookmarkEnd w:id="196"/>
+    <w:bookmarkStart w:id="214" w:name="quality-scores-the-phred-system"/>
     <w:p>
       <w:pPr>
         <w:pStyle w:val="Heading1"/>
@@ -32097,7 +32587,7 @@
         </w:pict>
       </w:r>
     </w:p>
-    <w:bookmarkStart w:id="192" w:name="the-big-idea-8"/>
+    <w:bookmarkStart w:id="197" w:name="the-big-idea-8"/>
     <w:p>
       <w:pPr>
         <w:pStyle w:val="Heading2"/>
@@ -32327,8 +32817,8 @@
         </w:pict>
       </w:r>
     </w:p>
-    <w:bookmarkEnd w:id="192"/>
-    <w:bookmarkStart w:id="195" w:name="the-phred-quality-score"/>
+    <w:bookmarkEnd w:id="197"/>
+    <w:bookmarkStart w:id="200" w:name="the-phred-quality-score"/>
     <w:p>
       <w:pPr>
         <w:pStyle w:val="Heading2"/>
@@ -32368,7 +32858,7 @@
         <w:t xml:space="preserve">Where P = probability the base call is incorrect</w:t>
       </w:r>
     </w:p>
-    <w:bookmarkStart w:id="193" w:name="score-table"/>
+    <w:bookmarkStart w:id="198" w:name="score-table"/>
     <w:p>
       <w:pPr>
         <w:pStyle w:val="Heading3"/>
@@ -33043,8 +33533,8 @@
         <w:t xml:space="preserve">30</w:t>
       </w:r>
     </w:p>
-    <w:bookmarkEnd w:id="193"/>
-    <w:bookmarkStart w:id="194" w:name="what-q30-means"/>
+    <w:bookmarkEnd w:id="198"/>
+    <w:bookmarkStart w:id="199" w:name="what-q30-means"/>
     <w:p>
       <w:pPr>
         <w:pStyle w:val="Heading3"/>
@@ -33130,9 +33620,9 @@
         </w:pict>
       </w:r>
     </w:p>
-    <w:bookmarkEnd w:id="194"/>
-    <w:bookmarkEnd w:id="195"/>
-    <w:bookmarkStart w:id="197" w:name="quality-score-encoding-in-fastq"/>
+    <w:bookmarkEnd w:id="199"/>
+    <w:bookmarkEnd w:id="200"/>
+    <w:bookmarkStart w:id="202" w:name="quality-score-encoding-in-fastq"/>
     <w:p>
       <w:pPr>
         <w:pStyle w:val="Heading2"/>
@@ -33649,7 +34139,7 @@
         <w:t xml:space="preserve"># [40, 40, 40, 40, 40, 40, 40, 30, 40, 40, 40]</w:t>
       </w:r>
     </w:p>
-    <w:bookmarkStart w:id="196" w:name="encoding-standards"/>
+    <w:bookmarkStart w:id="201" w:name="encoding-standards"/>
     <w:p>
       <w:pPr>
         <w:pStyle w:val="Heading3"/>
@@ -33875,9 +34365,9 @@
         </w:pict>
       </w:r>
     </w:p>
-    <w:bookmarkEnd w:id="196"/>
-    <w:bookmarkEnd w:id="197"/>
-    <w:bookmarkStart w:id="198" w:name="quality-score-distributions"/>
+    <w:bookmarkEnd w:id="201"/>
+    <w:bookmarkEnd w:id="202"/>
+    <w:bookmarkStart w:id="203" w:name="quality-score-distributions"/>
     <w:p>
       <w:pPr>
         <w:pStyle w:val="Heading2"/>
@@ -34071,8 +34561,8 @@
         </w:pict>
       </w:r>
     </w:p>
-    <w:bookmarkEnd w:id="198"/>
-    <w:bookmarkStart w:id="199" w:name="base-calling-quality-and-accuracy"/>
+    <w:bookmarkEnd w:id="203"/>
+    <w:bookmarkStart w:id="204" w:name="base-calling-quality-and-accuracy"/>
     <w:p>
       <w:pPr>
         <w:pStyle w:val="Heading2"/>
@@ -34215,8 +34705,8 @@
         </w:pict>
       </w:r>
     </w:p>
-    <w:bookmarkEnd w:id="199"/>
-    <w:bookmarkStart w:id="203" w:name="quality-in-downstream-tools"/>
+    <w:bookmarkEnd w:id="204"/>
+    <w:bookmarkStart w:id="208" w:name="quality-in-downstream-tools"/>
     <w:p>
       <w:pPr>
         <w:pStyle w:val="Heading2"/>
@@ -34225,7 +34715,7 @@
         <w:t xml:space="preserve">5. Quality in Downstream Tools</w:t>
       </w:r>
     </w:p>
-    <w:bookmarkStart w:id="200" w:name="in-sambam-files"/>
+    <w:bookmarkStart w:id="205" w:name="in-sambam-files"/>
     <w:p>
       <w:pPr>
         <w:pStyle w:val="Heading3"/>
@@ -34462,8 +34952,8 @@
         <w:t xml:space="preserve">-n</w:t>
       </w:r>
     </w:p>
-    <w:bookmarkEnd w:id="200"/>
-    <w:bookmarkStart w:id="201" w:name="in-vcf-files"/>
+    <w:bookmarkEnd w:id="205"/>
+    <w:bookmarkStart w:id="206" w:name="in-vcf-files"/>
     <w:p>
       <w:pPr>
         <w:pStyle w:val="Heading3"/>
@@ -34521,8 +35011,8 @@
         <w:t xml:space="preserve">QUAL=0   → P(wrong) = 1.0    (useless)</w:t>
       </w:r>
     </w:p>
-    <w:bookmarkEnd w:id="201"/>
-    <w:bookmarkStart w:id="202" w:name="quality-filtering"/>
+    <w:bookmarkEnd w:id="206"/>
+    <w:bookmarkStart w:id="207" w:name="quality-filtering"/>
     <w:p>
       <w:pPr>
         <w:pStyle w:val="Heading3"/>
@@ -34690,9 +35180,9 @@
         </w:pict>
       </w:r>
     </w:p>
-    <w:bookmarkEnd w:id="202"/>
-    <w:bookmarkEnd w:id="203"/>
-    <w:bookmarkStart w:id="204" w:name="quality-score-calibration"/>
+    <w:bookmarkEnd w:id="207"/>
+    <w:bookmarkEnd w:id="208"/>
+    <w:bookmarkStart w:id="209" w:name="quality-score-calibration"/>
     <w:p>
       <w:pPr>
         <w:pStyle w:val="Heading2"/>
@@ -35000,8 +35490,8 @@
         </w:pict>
       </w:r>
     </w:p>
-    <w:bookmarkEnd w:id="204"/>
-    <w:bookmarkStart w:id="205" w:name="practical-quality-commands"/>
+    <w:bookmarkEnd w:id="209"/>
+    <w:bookmarkStart w:id="210" w:name="practical-quality-commands"/>
     <w:p>
       <w:pPr>
         <w:pStyle w:val="Heading2"/>
@@ -35457,8 +35947,8 @@
         </w:pict>
       </w:r>
     </w:p>
-    <w:bookmarkEnd w:id="205"/>
-    <w:bookmarkStart w:id="206" w:name="exercises-8"/>
+    <w:bookmarkEnd w:id="210"/>
+    <w:bookmarkStart w:id="211" w:name="exercises-8"/>
     <w:p>
       <w:pPr>
         <w:pStyle w:val="Heading2"/>
@@ -35589,8 +36079,8 @@
         </w:pict>
       </w:r>
     </w:p>
-    <w:bookmarkEnd w:id="206"/>
-    <w:bookmarkStart w:id="207" w:name="key-terms-8"/>
+    <w:bookmarkEnd w:id="211"/>
+    <w:bookmarkStart w:id="212" w:name="key-terms-8"/>
     <w:p>
       <w:pPr>
         <w:pStyle w:val="Heading2"/>
@@ -35812,8 +36302,8 @@
         </w:pict>
       </w:r>
     </w:p>
-    <w:bookmarkEnd w:id="207"/>
-    <w:bookmarkStart w:id="208" w:name="next-steps-8"/>
+    <w:bookmarkEnd w:id="212"/>
+    <w:bookmarkStart w:id="213" w:name="next-steps-8"/>
     <w:p>
       <w:pPr>
         <w:pStyle w:val="Heading2"/>
@@ -35906,9 +36396,9 @@
         <w:t xml:space="preserve">“Quality scores are p-values for each base. Treat them with the same skepticism.”</w:t>
       </w:r>
     </w:p>
-    <w:bookmarkEnd w:id="208"/>
-    <w:bookmarkEnd w:id="209"/>
-    <w:bookmarkStart w:id="232" w:name="X8e87b86e0caa0ed027a91407734ae3ed387dee9"/>
+    <w:bookmarkEnd w:id="213"/>
+    <w:bookmarkEnd w:id="214"/>
+    <w:bookmarkStart w:id="237" w:name="X8e87b86e0caa0ed027a91407734ae3ed387dee9"/>
     <w:p>
       <w:pPr>
         <w:pStyle w:val="Heading1"/>
@@ -36014,7 +36504,7 @@
         </w:pict>
       </w:r>
     </w:p>
-    <w:bookmarkStart w:id="210" w:name="the-big-idea-9"/>
+    <w:bookmarkStart w:id="215" w:name="the-big-idea-9"/>
     <w:p>
       <w:pPr>
         <w:pStyle w:val="Heading2"/>
@@ -36067,8 +36557,8 @@
         </w:pict>
       </w:r>
     </w:p>
-    <w:bookmarkEnd w:id="210"/>
-    <w:bookmarkStart w:id="213" w:name="fastqc-the-first-thing-you-run"/>
+    <w:bookmarkEnd w:id="215"/>
+    <w:bookmarkStart w:id="218" w:name="fastqc-the-first-thing-you-run"/>
     <w:p>
       <w:pPr>
         <w:pStyle w:val="Heading2"/>
@@ -36340,7 +36830,7 @@
         <w:t xml:space="preserve">  Single peak ~41%                  Two peaks = different source</w:t>
       </w:r>
     </w:p>
-    <w:bookmarkStart w:id="211" w:name="key-fastqc-modules"/>
+    <w:bookmarkStart w:id="216" w:name="key-fastqc-modules"/>
     <w:p>
       <w:pPr>
         <w:pStyle w:val="Heading3"/>
@@ -36751,8 +37241,8 @@
         </w:tc>
       </w:tr>
     </w:tbl>
-    <w:bookmarkEnd w:id="211"/>
-    <w:bookmarkStart w:id="212" w:name="interpreting-fastqc-output"/>
+    <w:bookmarkEnd w:id="216"/>
+    <w:bookmarkStart w:id="217" w:name="interpreting-fastqc-output"/>
     <w:p>
       <w:pPr>
         <w:pStyle w:val="Heading3"/>
@@ -37045,9 +37535,9 @@
         </w:pict>
       </w:r>
     </w:p>
-    <w:bookmarkEnd w:id="212"/>
-    <w:bookmarkEnd w:id="213"/>
-    <w:bookmarkStart w:id="216" w:name="quality-trimming"/>
+    <w:bookmarkEnd w:id="217"/>
+    <w:bookmarkEnd w:id="218"/>
+    <w:bookmarkStart w:id="221" w:name="quality-trimming"/>
     <w:p>
       <w:pPr>
         <w:pStyle w:val="Heading2"/>
@@ -37114,7 +37604,7 @@
         <w:t xml:space="preserve">  ACTGACTGACTGACTGACTGACTGACTGACTG</w:t>
       </w:r>
     </w:p>
-    <w:bookmarkStart w:id="214" w:name="trimming-tools"/>
+    <w:bookmarkStart w:id="219" w:name="trimming-tools"/>
     <w:p>
       <w:pPr>
         <w:pStyle w:val="Heading3"/>
@@ -37506,8 +37996,8 @@
         <w:t xml:space="preserve">         sample_R1.fastq.gz sample_R2.fastq.gz</w:t>
       </w:r>
     </w:p>
-    <w:bookmarkEnd w:id="214"/>
-    <w:bookmarkStart w:id="215" w:name="fastqc-before-vs-after"/>
+    <w:bookmarkEnd w:id="219"/>
+    <w:bookmarkStart w:id="220" w:name="fastqc-before-vs-after"/>
     <w:p>
       <w:pPr>
         <w:pStyle w:val="Heading3"/>
@@ -37603,9 +38093,9 @@
         </w:pict>
       </w:r>
     </w:p>
-    <w:bookmarkEnd w:id="215"/>
-    <w:bookmarkEnd w:id="216"/>
-    <w:bookmarkStart w:id="219" w:name="adapter-contamination"/>
+    <w:bookmarkEnd w:id="220"/>
+    <w:bookmarkEnd w:id="221"/>
+    <w:bookmarkStart w:id="224" w:name="adapter-contamination"/>
     <w:p>
       <w:pPr>
         <w:pStyle w:val="Heading2"/>
@@ -37651,7 +38141,7 @@
         <w:t xml:space="preserve">                       Adapter sequence (should be removed)</w:t>
       </w:r>
     </w:p>
-    <w:bookmarkStart w:id="217" w:name="detection"/>
+    <w:bookmarkStart w:id="222" w:name="detection"/>
     <w:p>
       <w:pPr>
         <w:pStyle w:val="Heading3"/>
@@ -37881,8 +38371,8 @@
         <w:t xml:space="preserve">"import json,sys; d=json.load(sys.stdin); print(d['adapter_cutting']['adapter_trimmed_reads'])"</w:t>
       </w:r>
     </w:p>
-    <w:bookmarkEnd w:id="217"/>
-    <w:bookmarkStart w:id="218" w:name="how-much-adapter-to-expect"/>
+    <w:bookmarkEnd w:id="222"/>
+    <w:bookmarkStart w:id="223" w:name="how-much-adapter-to-expect"/>
     <w:p>
       <w:pPr>
         <w:pStyle w:val="Heading3"/>
@@ -37927,9 +38417,9 @@
         </w:pict>
       </w:r>
     </w:p>
-    <w:bookmarkEnd w:id="218"/>
-    <w:bookmarkEnd w:id="219"/>
-    <w:bookmarkStart w:id="221" w:name="pcr-duplicates"/>
+    <w:bookmarkEnd w:id="223"/>
+    <w:bookmarkEnd w:id="224"/>
+    <w:bookmarkStart w:id="226" w:name="pcr-duplicates"/>
     <w:p>
       <w:pPr>
         <w:pStyle w:val="Heading2"/>
@@ -38017,7 +38507,7 @@
         <w:t xml:space="preserve">High duplicates = wasted sequencing budget. You’re paying for the same molecule multiple times.</w:t>
       </w:r>
     </w:p>
-    <w:bookmarkStart w:id="220" w:name="marking-duplicates"/>
+    <w:bookmarkStart w:id="225" w:name="marking-duplicates"/>
     <w:p>
       <w:pPr>
         <w:pStyle w:val="Heading3"/>
@@ -38264,9 +38754,9 @@
         </w:pict>
       </w:r>
     </w:p>
-    <w:bookmarkEnd w:id="220"/>
-    <w:bookmarkEnd w:id="221"/>
-    <w:bookmarkStart w:id="224" w:name="contamination-detection"/>
+    <w:bookmarkEnd w:id="225"/>
+    <w:bookmarkEnd w:id="226"/>
+    <w:bookmarkStart w:id="229" w:name="contamination-detection"/>
     <w:p>
       <w:pPr>
         <w:pStyle w:val="Heading2"/>
@@ -38275,7 +38765,7 @@
         <w:t xml:space="preserve">5. Contamination Detection</w:t>
       </w:r>
     </w:p>
-    <w:bookmarkStart w:id="222" w:name="cross-sample-contamination"/>
+    <w:bookmarkStart w:id="227" w:name="cross-sample-contamination"/>
     <w:p>
       <w:pPr>
         <w:pStyle w:val="Heading3"/>
@@ -38415,8 +38905,8 @@
         <w:t xml:space="preserve"> known_genotypes.vcf.gz sample.vcf.gz</w:t>
       </w:r>
     </w:p>
-    <w:bookmarkEnd w:id="222"/>
-    <w:bookmarkStart w:id="223" w:name="adapterindex-hopping"/>
+    <w:bookmarkEnd w:id="227"/>
+    <w:bookmarkStart w:id="228" w:name="adapterindex-hopping"/>
     <w:p>
       <w:pPr>
         <w:pStyle w:val="Heading3"/>
@@ -38472,9 +38962,9 @@
         </w:pict>
       </w:r>
     </w:p>
-    <w:bookmarkEnd w:id="223"/>
-    <w:bookmarkEnd w:id="224"/>
-    <w:bookmarkStart w:id="226" w:name="qc-reporting-tools"/>
+    <w:bookmarkEnd w:id="228"/>
+    <w:bookmarkEnd w:id="229"/>
+    <w:bookmarkStart w:id="231" w:name="qc-reporting-tools"/>
     <w:p>
       <w:pPr>
         <w:pStyle w:val="Heading2"/>
@@ -38662,7 +39152,7 @@
         </w:tc>
       </w:tr>
     </w:tbl>
-    <w:bookmarkStart w:id="225" w:name="multiqc-example"/>
+    <w:bookmarkStart w:id="230" w:name="multiqc-example"/>
     <w:p>
       <w:pPr>
         <w:pStyle w:val="Heading3"/>
@@ -38724,9 +39214,9 @@
         </w:pict>
       </w:r>
     </w:p>
-    <w:bookmarkEnd w:id="225"/>
-    <w:bookmarkEnd w:id="226"/>
-    <w:bookmarkStart w:id="227" w:name="qc-decision-tree"/>
+    <w:bookmarkEnd w:id="230"/>
+    <w:bookmarkEnd w:id="231"/>
+    <w:bookmarkStart w:id="232" w:name="qc-decision-tree"/>
     <w:p>
       <w:pPr>
         <w:pStyle w:val="Heading2"/>
@@ -38915,8 +39405,8 @@
         </w:pict>
       </w:r>
     </w:p>
-    <w:bookmarkEnd w:id="227"/>
-    <w:bookmarkStart w:id="228" w:name="example-complete-qc-workflow"/>
+    <w:bookmarkEnd w:id="232"/>
+    <w:bookmarkStart w:id="233" w:name="example-complete-qc-workflow"/>
     <w:p>
       <w:pPr>
         <w:pStyle w:val="Heading2"/>
@@ -39474,8 +39964,8 @@
         </w:pict>
       </w:r>
     </w:p>
-    <w:bookmarkEnd w:id="228"/>
-    <w:bookmarkStart w:id="229" w:name="exercises-9"/>
+    <w:bookmarkEnd w:id="233"/>
+    <w:bookmarkStart w:id="234" w:name="exercises-9"/>
     <w:p>
       <w:pPr>
         <w:pStyle w:val="Heading2"/>
@@ -39567,8 +40057,8 @@
         </w:pict>
       </w:r>
     </w:p>
-    <w:bookmarkEnd w:id="229"/>
-    <w:bookmarkStart w:id="230" w:name="key-terms-9"/>
+    <w:bookmarkEnd w:id="234"/>
+    <w:bookmarkStart w:id="235" w:name="key-terms-9"/>
     <w:p>
       <w:pPr>
         <w:pStyle w:val="Heading2"/>
@@ -39815,8 +40305,8 @@
         </w:pict>
       </w:r>
     </w:p>
-    <w:bookmarkEnd w:id="230"/>
-    <w:bookmarkStart w:id="231" w:name="next-steps-9"/>
+    <w:bookmarkEnd w:id="235"/>
+    <w:bookmarkStart w:id="236" w:name="next-steps-9"/>
     <w:p>
       <w:pPr>
         <w:pStyle w:val="Heading2"/>
@@ -39909,9 +40399,9 @@
         <w:t xml:space="preserve">“Don’t trust data that hasn’t passed QC. Garbage in, variants out.”</w:t>
       </w:r>
     </w:p>
-    <w:bookmarkEnd w:id="231"/>
-    <w:bookmarkEnd w:id="232"/>
-    <w:bookmarkStart w:id="257" w:name="fasta-fastq-inputoutput-formats"/>
+    <w:bookmarkEnd w:id="236"/>
+    <w:bookmarkEnd w:id="237"/>
+    <w:bookmarkStart w:id="262" w:name="fasta-fastq-inputoutput-formats"/>
     <w:p>
       <w:pPr>
         <w:pStyle w:val="Heading1"/>
@@ -40005,7 +40495,7 @@
         </w:pict>
       </w:r>
     </w:p>
-    <w:bookmarkStart w:id="233" w:name="the-big-idea-10"/>
+    <w:bookmarkStart w:id="238" w:name="the-big-idea-10"/>
     <w:p>
       <w:pPr>
         <w:pStyle w:val="Heading2"/>
@@ -40075,8 +40565,8 @@
         </w:pict>
       </w:r>
     </w:p>
-    <w:bookmarkEnd w:id="233"/>
-    <w:bookmarkStart w:id="239" w:name="fasta-format"/>
+    <w:bookmarkEnd w:id="238"/>
+    <w:bookmarkStart w:id="244" w:name="fasta-format"/>
     <w:p>
       <w:pPr>
         <w:pStyle w:val="Heading2"/>
@@ -40085,7 +40575,7 @@
         <w:t xml:space="preserve">1. FASTA Format</w:t>
       </w:r>
     </w:p>
-    <w:bookmarkStart w:id="234" w:name="structure-1"/>
+    <w:bookmarkStart w:id="239" w:name="structure-1"/>
     <w:p>
       <w:pPr>
         <w:pStyle w:val="Heading3"/>
@@ -40212,8 +40702,8 @@
         <w:t xml:space="preserve">headers)</w:t>
       </w:r>
     </w:p>
-    <w:bookmarkEnd w:id="234"/>
-    <w:bookmarkStart w:id="235" w:name="examples-1"/>
+    <w:bookmarkEnd w:id="239"/>
+    <w:bookmarkStart w:id="240" w:name="examples-1"/>
     <w:p>
       <w:pPr>
         <w:pStyle w:val="Heading3"/>
@@ -40290,8 +40780,8 @@
         <w:t xml:space="preserve">...</w:t>
       </w:r>
     </w:p>
-    <w:bookmarkEnd w:id="235"/>
-    <w:bookmarkStart w:id="236" w:name="protein-fasta"/>
+    <w:bookmarkEnd w:id="240"/>
+    <w:bookmarkStart w:id="241" w:name="protein-fasta"/>
     <w:p>
       <w:pPr>
         <w:pStyle w:val="Heading3"/>
@@ -40329,8 +40819,8 @@
         <w:t xml:space="preserve">DEAPRMPEAAPPVAPAPAAPTPAAPAPAPSWPLSSSVPSQKTYQGSYGFRLGFLHSGTAK</w:t>
       </w:r>
     </w:p>
-    <w:bookmarkEnd w:id="236"/>
-    <w:bookmarkStart w:id="237" w:name="fasta-index-.fai"/>
+    <w:bookmarkEnd w:id="241"/>
+    <w:bookmarkStart w:id="242" w:name="fasta-index-.fai"/>
     <w:p>
       <w:pPr>
         <w:pStyle w:val="Heading3"/>
@@ -40448,8 +40938,8 @@
         <w:t xml:space="preserve"># Columns: name, length, offset, line_bases, line_width</w:t>
       </w:r>
     </w:p>
-    <w:bookmarkEnd w:id="237"/>
-    <w:bookmarkStart w:id="238" w:name="when-youll-use-fasta"/>
+    <w:bookmarkEnd w:id="242"/>
+    <w:bookmarkStart w:id="243" w:name="when-youll-use-fasta"/>
     <w:p>
       <w:pPr>
         <w:pStyle w:val="Heading3"/>
@@ -40512,9 +41002,9 @@
         </w:pict>
       </w:r>
     </w:p>
-    <w:bookmarkEnd w:id="238"/>
-    <w:bookmarkEnd w:id="239"/>
-    <w:bookmarkStart w:id="245" w:name="fastq-format"/>
+    <w:bookmarkEnd w:id="243"/>
+    <w:bookmarkEnd w:id="244"/>
+    <w:bookmarkStart w:id="250" w:name="fastq-format"/>
     <w:p>
       <w:pPr>
         <w:pStyle w:val="Heading2"/>
@@ -40523,7 +41013,7 @@
         <w:t xml:space="preserve">2. FASTQ Format</w:t>
       </w:r>
     </w:p>
-    <w:bookmarkStart w:id="240" w:name="structure-2"/>
+    <w:bookmarkStart w:id="245" w:name="structure-2"/>
     <w:p>
       <w:pPr>
         <w:pStyle w:val="Heading3"/>
@@ -40629,8 +41119,8 @@
         <w:t xml:space="preserve">QUALITY   (quality scores encoded as ASCII)</w:t>
       </w:r>
     </w:p>
-    <w:bookmarkEnd w:id="240"/>
-    <w:bookmarkStart w:id="241" w:name="example"/>
+    <w:bookmarkEnd w:id="245"/>
+    <w:bookmarkStart w:id="246" w:name="example"/>
     <w:p>
       <w:pPr>
         <w:pStyle w:val="Heading3"/>
@@ -40677,8 +41167,8 @@
         <w:t xml:space="preserve">IIIIIIIIIIIIIIIIIIIIIIIIIIIIIIIIIIIIIIIIIIIIIIIIIIIIIIIIIIII</w:t>
       </w:r>
     </w:p>
-    <w:bookmarkEnd w:id="241"/>
-    <w:bookmarkStart w:id="242" w:name="fastq-header-fields-illumina"/>
+    <w:bookmarkEnd w:id="246"/>
+    <w:bookmarkStart w:id="247" w:name="fastq-header-fields-illumina"/>
     <w:p>
       <w:pPr>
         <w:pStyle w:val="Heading3"/>
@@ -40770,8 +41260,8 @@
         <w:t xml:space="preserve">  └────────────────────────instrument ID</w:t>
       </w:r>
     </w:p>
-    <w:bookmarkEnd w:id="242"/>
-    <w:bookmarkStart w:id="243" w:name="quality-string-phred33"/>
+    <w:bookmarkEnd w:id="247"/>
+    <w:bookmarkStart w:id="248" w:name="quality-string-phred33"/>
     <w:p>
       <w:pPr>
         <w:pStyle w:val="Heading3"/>
@@ -41489,8 +41979,8 @@
         <w:t xml:space="preserve">"</w:t>
       </w:r>
     </w:p>
-    <w:bookmarkEnd w:id="243"/>
-    <w:bookmarkStart w:id="244" w:name="fastq-in-the-wild"/>
+    <w:bookmarkEnd w:id="248"/>
+    <w:bookmarkStart w:id="249" w:name="fastq-in-the-wild"/>
     <w:p>
       <w:pPr>
         <w:pStyle w:val="Heading3"/>
@@ -41892,9 +42382,9 @@
         </w:pict>
       </w:r>
     </w:p>
-    <w:bookmarkEnd w:id="244"/>
-    <w:bookmarkEnd w:id="245"/>
-    <w:bookmarkStart w:id="247" w:name="compression"/>
+    <w:bookmarkEnd w:id="249"/>
+    <w:bookmarkEnd w:id="250"/>
+    <w:bookmarkStart w:id="252" w:name="compression"/>
     <w:p>
       <w:pPr>
         <w:pStyle w:val="Heading2"/>
@@ -42039,7 +42529,7 @@
         <w:t xml:space="preserve">)</w:t>
       </w:r>
     </w:p>
-    <w:bookmarkStart w:id="246" w:name="gzip-vs-bgzip"/>
+    <w:bookmarkStart w:id="251" w:name="gzip-vs-bgzip"/>
     <w:p>
       <w:pPr>
         <w:pStyle w:val="Heading3"/>
@@ -42255,9 +42745,9 @@
         </w:pict>
       </w:r>
     </w:p>
-    <w:bookmarkEnd w:id="246"/>
-    <w:bookmarkEnd w:id="247"/>
-    <w:bookmarkStart w:id="251" w:name="common-fastq-problems"/>
+    <w:bookmarkEnd w:id="251"/>
+    <w:bookmarkEnd w:id="252"/>
+    <w:bookmarkStart w:id="256" w:name="common-fastq-problems"/>
     <w:p>
       <w:pPr>
         <w:pStyle w:val="Heading2"/>
@@ -42266,7 +42756,7 @@
         <w:t xml:space="preserve">4. Common FASTQ Problems</w:t>
       </w:r>
     </w:p>
-    <w:bookmarkStart w:id="248" w:name="mislabeled-pairs"/>
+    <w:bookmarkStart w:id="253" w:name="mislabeled-pairs"/>
     <w:p>
       <w:pPr>
         <w:pStyle w:val="Heading3"/>
@@ -42504,8 +42994,8 @@
         <w:t xml:space="preserve"># should end with /2</w:t>
       </w:r>
     </w:p>
-    <w:bookmarkEnd w:id="248"/>
-    <w:bookmarkStart w:id="249" w:name="interleaved-fastq"/>
+    <w:bookmarkEnd w:id="253"/>
+    <w:bookmarkStart w:id="254" w:name="interleaved-fastq"/>
     <w:p>
       <w:pPr>
         <w:pStyle w:val="Heading3"/>
@@ -42578,8 +43068,8 @@
         <w:t xml:space="preserve">IIII</w:t>
       </w:r>
     </w:p>
-    <w:bookmarkEnd w:id="249"/>
-    <w:bookmarkStart w:id="250" w:name="unmatched-read-counts-r1-vs-r2"/>
+    <w:bookmarkEnd w:id="254"/>
+    <w:bookmarkStart w:id="255" w:name="unmatched-read-counts-r1-vs-r2"/>
     <w:p>
       <w:pPr>
         <w:pStyle w:val="Heading3"/>
@@ -42968,9 +43458,9 @@
         </w:pict>
       </w:r>
     </w:p>
-    <w:bookmarkEnd w:id="250"/>
-    <w:bookmarkEnd w:id="251"/>
-    <w:bookmarkStart w:id="252" w:name="Xe9fc47aa8ad0158fea8ef2fa588501c4f8bb843"/>
+    <w:bookmarkEnd w:id="255"/>
+    <w:bookmarkEnd w:id="256"/>
+    <w:bookmarkStart w:id="257" w:name="Xe9fc47aa8ad0158fea8ef2fa588501c4f8bb843"/>
     <w:p>
       <w:pPr>
         <w:pStyle w:val="Heading2"/>
@@ -44941,8 +45431,8 @@
         </w:pict>
       </w:r>
     </w:p>
-    <w:bookmarkEnd w:id="252"/>
-    <w:bookmarkStart w:id="253" w:name="file-size-estimation"/>
+    <w:bookmarkEnd w:id="257"/>
+    <w:bookmarkStart w:id="258" w:name="file-size-estimation"/>
     <w:p>
       <w:pPr>
         <w:pStyle w:val="Heading2"/>
@@ -45629,8 +46119,8 @@
         </w:pict>
       </w:r>
     </w:p>
-    <w:bookmarkEnd w:id="253"/>
-    <w:bookmarkStart w:id="254" w:name="exercises-10"/>
+    <w:bookmarkEnd w:id="258"/>
+    <w:bookmarkStart w:id="259" w:name="exercises-10"/>
     <w:p>
       <w:pPr>
         <w:pStyle w:val="Heading2"/>
@@ -45721,8 +46211,8 @@
         </w:pict>
       </w:r>
     </w:p>
-    <w:bookmarkEnd w:id="254"/>
-    <w:bookmarkStart w:id="255" w:name="key-terms-10"/>
+    <w:bookmarkEnd w:id="259"/>
+    <w:bookmarkStart w:id="260" w:name="key-terms-10"/>
     <w:p>
       <w:pPr>
         <w:pStyle w:val="Heading2"/>
@@ -45933,8 +46423,8 @@
         </w:pict>
       </w:r>
     </w:p>
-    <w:bookmarkEnd w:id="255"/>
-    <w:bookmarkStart w:id="256" w:name="next-steps-10"/>
+    <w:bookmarkEnd w:id="260"/>
+    <w:bookmarkStart w:id="261" w:name="next-steps-10"/>
     <w:p>
       <w:pPr>
         <w:pStyle w:val="Heading2"/>
@@ -46027,9 +46517,9 @@
         <w:t xml:space="preserve">“FASTQ is raw sensor data. Treat it as irreplaceable.”</w:t>
       </w:r>
     </w:p>
-    <w:bookmarkEnd w:id="256"/>
-    <w:bookmarkEnd w:id="257"/>
-    <w:bookmarkStart w:id="282" w:name="sam-bam-cram-aligned-read-formats"/>
+    <w:bookmarkEnd w:id="261"/>
+    <w:bookmarkEnd w:id="262"/>
+    <w:bookmarkStart w:id="287" w:name="sam-bam-cram-aligned-read-formats"/>
     <w:p>
       <w:pPr>
         <w:pStyle w:val="Heading1"/>
@@ -46111,7 +46601,7 @@
         </w:pict>
       </w:r>
     </w:p>
-    <w:bookmarkStart w:id="258" w:name="the-big-idea-11"/>
+    <w:bookmarkStart w:id="263" w:name="the-big-idea-11"/>
     <w:p>
       <w:pPr>
         <w:pStyle w:val="Heading2"/>
@@ -46838,8 +47328,8 @@
         </w:tc>
       </w:tr>
     </w:tbl>
-    <w:bookmarkEnd w:id="258"/>
-    <w:bookmarkStart w:id="263" w:name="sam-format-the-specification"/>
+    <w:bookmarkEnd w:id="263"/>
+    <w:bookmarkStart w:id="268" w:name="sam-format-the-specification"/>
     <w:p>
       <w:pPr>
         <w:pStyle w:val="Heading2"/>
@@ -46848,7 +47338,7 @@
         <w:t xml:space="preserve">1. SAM Format: The Specification</w:t>
       </w:r>
     </w:p>
-    <w:bookmarkStart w:id="259" w:name="header-section-starts-with"/>
+    <w:bookmarkStart w:id="264" w:name="header-section-starts-with"/>
     <w:p>
       <w:pPr>
         <w:pStyle w:val="Heading3"/>
@@ -46904,8 +47394,8 @@
         <w:t xml:space="preserve">@PG ID:bwa PN:bwa           (program record)</w:t>
       </w:r>
     </w:p>
-    <w:bookmarkEnd w:id="259"/>
-    <w:bookmarkStart w:id="260" w:name="X774c308b1d49b4b1b6d845f63ffdac5f372c0d8"/>
+    <w:bookmarkEnd w:id="264"/>
+    <w:bookmarkStart w:id="265" w:name="X774c308b1d49b4b1b6d845f63ffdac5f372c0d8"/>
     <w:p>
       <w:pPr>
         <w:pStyle w:val="Heading3"/>
@@ -47033,8 +47523,8 @@
         <w:t xml:space="preserve">11   QUAL    String  Quality scores (Phred+33)</w:t>
       </w:r>
     </w:p>
-    <w:bookmarkEnd w:id="260"/>
-    <w:bookmarkStart w:id="261" w:name="example-sam-lines"/>
+    <w:bookmarkEnd w:id="265"/>
+    <w:bookmarkStart w:id="266" w:name="example-sam-lines"/>
     <w:p>
       <w:pPr>
         <w:pStyle w:val="Heading3"/>
@@ -47215,8 +47705,8 @@
         <w:t xml:space="preserve">RG:Z:sample1 - tag: read group</w:t>
       </w:r>
     </w:p>
-    <w:bookmarkEnd w:id="261"/>
-    <w:bookmarkStart w:id="262" w:name="sam-flag-reference"/>
+    <w:bookmarkEnd w:id="266"/>
+    <w:bookmarkStart w:id="267" w:name="sam-flag-reference"/>
     <w:p>
       <w:pPr>
         <w:pStyle w:val="Heading3"/>
@@ -48028,9 +48518,9 @@
         </w:pict>
       </w:r>
     </w:p>
-    <w:bookmarkEnd w:id="262"/>
-    <w:bookmarkEnd w:id="263"/>
-    <w:bookmarkStart w:id="267" w:name="bam-the-binary-format"/>
+    <w:bookmarkEnd w:id="267"/>
+    <w:bookmarkEnd w:id="268"/>
+    <w:bookmarkStart w:id="272" w:name="bam-the-binary-format"/>
     <w:p>
       <w:pPr>
         <w:pStyle w:val="Heading2"/>
@@ -48063,7 +48553,7 @@
         <w:t xml:space="preserve">version of SAM.</w:t>
       </w:r>
     </w:p>
-    <w:bookmarkStart w:id="264" w:name="structure-3"/>
+    <w:bookmarkStart w:id="269" w:name="structure-3"/>
     <w:p>
       <w:pPr>
         <w:pStyle w:val="Heading3"/>
@@ -48131,8 +48621,8 @@
         <w:t xml:space="preserve">  - Block compression (BGZF) for random access</w:t>
       </w:r>
     </w:p>
-    <w:bookmarkEnd w:id="264"/>
-    <w:bookmarkStart w:id="265" w:name="size-comparison"/>
+    <w:bookmarkEnd w:id="269"/>
+    <w:bookmarkStart w:id="270" w:name="size-comparison"/>
     <w:p>
       <w:pPr>
         <w:pStyle w:val="Heading3"/>
@@ -48235,8 +48725,8 @@
         <w:t xml:space="preserve">CRAM:      ~9 GB   (with reference)</w:t>
       </w:r>
     </w:p>
-    <w:bookmarkEnd w:id="265"/>
-    <w:bookmarkStart w:id="266" w:name="bam-index-.bai"/>
+    <w:bookmarkEnd w:id="270"/>
+    <w:bookmarkStart w:id="271" w:name="bam-index-.bai"/>
     <w:p>
       <w:pPr>
         <w:pStyle w:val="Heading3"/>
@@ -48385,9 +48875,9 @@
         </w:pict>
       </w:r>
     </w:p>
-    <w:bookmarkEnd w:id="266"/>
-    <w:bookmarkEnd w:id="267"/>
-    <w:bookmarkStart w:id="270" w:name="cram-reference-based-compression"/>
+    <w:bookmarkEnd w:id="271"/>
+    <w:bookmarkEnd w:id="272"/>
+    <w:bookmarkStart w:id="275" w:name="cram-reference-based-compression"/>
     <w:p>
       <w:pPr>
         <w:pStyle w:val="Heading2"/>
@@ -48485,7 +48975,7 @@
         <w:t xml:space="preserve">    (Much less data when alignment is close to reference)</w:t>
       </w:r>
     </w:p>
-    <w:bookmarkStart w:id="268" w:name="size-comparison-for-30-human-wgs"/>
+    <w:bookmarkStart w:id="273" w:name="size-comparison-for-30-human-wgs"/>
     <w:p>
       <w:pPr>
         <w:pStyle w:val="Heading3"/>
@@ -48550,8 +49040,8 @@
         <w:t xml:space="preserve">CRAM (lossy) 25 GB   0.28×</w:t>
       </w:r>
     </w:p>
-    <w:bookmarkEnd w:id="268"/>
-    <w:bookmarkStart w:id="269" w:name="cram-lossy-mode"/>
+    <w:bookmarkEnd w:id="273"/>
+    <w:bookmarkStart w:id="274" w:name="cram-lossy-mode"/>
     <w:p>
       <w:pPr>
         <w:pStyle w:val="Heading3"/>
@@ -48730,9 +49220,9 @@
         </w:pict>
       </w:r>
     </w:p>
-    <w:bookmarkEnd w:id="269"/>
-    <w:bookmarkEnd w:id="270"/>
-    <w:bookmarkStart w:id="271" w:name="converting-between-formats"/>
+    <w:bookmarkEnd w:id="274"/>
+    <w:bookmarkEnd w:id="275"/>
+    <w:bookmarkStart w:id="276" w:name="converting-between-formats"/>
     <w:p>
       <w:pPr>
         <w:pStyle w:val="Heading2"/>
@@ -49053,8 +49543,8 @@
         </w:pict>
       </w:r>
     </w:p>
-    <w:bookmarkEnd w:id="271"/>
-    <w:bookmarkStart w:id="275" w:name="key-operations"/>
+    <w:bookmarkEnd w:id="276"/>
+    <w:bookmarkStart w:id="280" w:name="key-operations"/>
     <w:p>
       <w:pPr>
         <w:pStyle w:val="Heading2"/>
@@ -49063,7 +49553,7 @@
         <w:t xml:space="preserve">5. Key Operations</w:t>
       </w:r>
     </w:p>
-    <w:bookmarkStart w:id="272" w:name="region-query-requires-index"/>
+    <w:bookmarkStart w:id="277" w:name="region-query-requires-index"/>
     <w:p>
       <w:pPr>
         <w:pStyle w:val="Heading3"/>
@@ -49176,8 +49666,8 @@
         <w:t xml:space="preserve"> genes.bed aligned.bam</w:t>
       </w:r>
     </w:p>
-    <w:bookmarkEnd w:id="272"/>
-    <w:bookmarkStart w:id="273" w:name="flag-filtering"/>
+    <w:bookmarkEnd w:id="277"/>
+    <w:bookmarkStart w:id="278" w:name="flag-filtering"/>
     <w:p>
       <w:pPr>
         <w:pStyle w:val="Heading3"/>
@@ -49398,8 +49888,8 @@
         <w:t xml:space="preserve"># 1028 = 4+1024</w:t>
       </w:r>
     </w:p>
-    <w:bookmarkEnd w:id="273"/>
-    <w:bookmarkStart w:id="274" w:name="statistics"/>
+    <w:bookmarkEnd w:id="278"/>
+    <w:bookmarkStart w:id="279" w:name="statistics"/>
     <w:p>
       <w:pPr>
         <w:pStyle w:val="Heading3"/>
@@ -49534,9 +50024,9 @@
         </w:pict>
       </w:r>
     </w:p>
-    <w:bookmarkEnd w:id="274"/>
-    <w:bookmarkEnd w:id="275"/>
-    <w:bookmarkStart w:id="276" w:name="sambam-in-code-python"/>
+    <w:bookmarkEnd w:id="279"/>
+    <w:bookmarkEnd w:id="280"/>
+    <w:bookmarkStart w:id="281" w:name="sambam-in-code-python"/>
     <w:p>
       <w:pPr>
         <w:pStyle w:val="Heading2"/>
@@ -50007,8 +50497,8 @@
         </w:pict>
       </w:r>
     </w:p>
-    <w:bookmarkEnd w:id="276"/>
-    <w:bookmarkStart w:id="277" w:name="sambam-in-code-c-portfolio-project"/>
+    <w:bookmarkEnd w:id="281"/>
+    <w:bookmarkStart w:id="282" w:name="sambam-in-code-c-portfolio-project"/>
     <w:p>
       <w:pPr>
         <w:pStyle w:val="Heading2"/>
@@ -51067,8 +51557,8 @@
         </w:pict>
       </w:r>
     </w:p>
-    <w:bookmarkEnd w:id="277"/>
-    <w:bookmarkStart w:id="278" w:name="file-validation"/>
+    <w:bookmarkEnd w:id="282"/>
+    <w:bookmarkStart w:id="283" w:name="file-validation"/>
     <w:p>
       <w:pPr>
         <w:pStyle w:val="Heading2"/>
@@ -51380,8 +51870,8 @@
         </w:pict>
       </w:r>
     </w:p>
-    <w:bookmarkEnd w:id="278"/>
-    <w:bookmarkStart w:id="279" w:name="exercises-11"/>
+    <w:bookmarkEnd w:id="283"/>
+    <w:bookmarkStart w:id="284" w:name="exercises-11"/>
     <w:p>
       <w:pPr>
         <w:pStyle w:val="Heading2"/>
@@ -51472,8 +51962,8 @@
         </w:pict>
       </w:r>
     </w:p>
-    <w:bookmarkEnd w:id="279"/>
-    <w:bookmarkStart w:id="280" w:name="key-terms-11"/>
+    <w:bookmarkEnd w:id="284"/>
+    <w:bookmarkStart w:id="285" w:name="key-terms-11"/>
     <w:p>
       <w:pPr>
         <w:pStyle w:val="Heading2"/>
@@ -51743,8 +52233,8 @@
         </w:pict>
       </w:r>
     </w:p>
-    <w:bookmarkEnd w:id="280"/>
-    <w:bookmarkStart w:id="281" w:name="next-steps-11"/>
+    <w:bookmarkEnd w:id="285"/>
+    <w:bookmarkStart w:id="286" w:name="next-steps-11"/>
     <w:p>
       <w:pPr>
         <w:pStyle w:val="Heading2"/>
@@ -51837,9 +52327,9 @@
         <w:t xml:space="preserve">“BAM is the ZIP file of genomics — ubiquitous, compressed, and indexed.”</w:t>
       </w:r>
     </w:p>
-    <w:bookmarkEnd w:id="281"/>
-    <w:bookmarkEnd w:id="282"/>
-    <w:bookmarkStart w:id="309" w:name="vcf-bcf-variant-call-format"/>
+    <w:bookmarkEnd w:id="286"/>
+    <w:bookmarkEnd w:id="287"/>
+    <w:bookmarkStart w:id="314" w:name="vcf-bcf-variant-call-format"/>
     <w:p>
       <w:pPr>
         <w:pStyle w:val="Heading1"/>
@@ -51933,7 +52423,7 @@
         </w:pict>
       </w:r>
     </w:p>
-    <w:bookmarkStart w:id="283" w:name="the-big-idea-12"/>
+    <w:bookmarkStart w:id="288" w:name="the-big-idea-12"/>
     <w:p>
       <w:pPr>
         <w:pStyle w:val="Heading2"/>
@@ -52545,8 +53035,8 @@
         <w:t xml:space="preserve">    style Final fill:#276749,color:#fff</w:t>
       </w:r>
     </w:p>
-    <w:bookmarkEnd w:id="283"/>
-    <w:bookmarkStart w:id="286" w:name="vcf-file-structure"/>
+    <w:bookmarkEnd w:id="288"/>
+    <w:bookmarkStart w:id="291" w:name="vcf-file-structure"/>
     <w:p>
       <w:pPr>
         <w:pStyle w:val="Heading2"/>
@@ -52595,7 +53085,7 @@
         <w:t xml:space="preserve">(variants).</w:t>
       </w:r>
     </w:p>
-    <w:bookmarkStart w:id="284" w:name="header-lines"/>
+    <w:bookmarkStart w:id="289" w:name="header-lines"/>
     <w:p>
       <w:pPr>
         <w:pStyle w:val="Heading3"/>
@@ -52705,8 +53195,8 @@
         <w:t xml:space="preserve">#CHROM  POS     ID      REF     ALT     QUAL    FILTER  INFO    FORMAT  SAMPLE1</w:t>
       </w:r>
     </w:p>
-    <w:bookmarkEnd w:id="284"/>
-    <w:bookmarkStart w:id="285" w:name="required-columns"/>
+    <w:bookmarkEnd w:id="289"/>
+    <w:bookmarkStart w:id="290" w:name="required-columns"/>
     <w:p>
       <w:pPr>
         <w:pStyle w:val="Heading3"/>
@@ -53178,9 +53668,9 @@
         </w:pict>
       </w:r>
     </w:p>
-    <w:bookmarkEnd w:id="285"/>
-    <w:bookmarkEnd w:id="286"/>
-    <w:bookmarkStart w:id="290" w:name="genotype-encoding"/>
+    <w:bookmarkEnd w:id="290"/>
+    <w:bookmarkEnd w:id="291"/>
+    <w:bookmarkStart w:id="295" w:name="genotype-encoding"/>
     <w:p>
       <w:pPr>
         <w:pStyle w:val="Heading2"/>
@@ -53189,7 +53679,7 @@
         <w:t xml:space="preserve">2. Genotype Encoding</w:t>
       </w:r>
     </w:p>
-    <w:bookmarkStart w:id="287" w:name="gt-genotype"/>
+    <w:bookmarkStart w:id="292" w:name="gt-genotype"/>
     <w:p>
       <w:pPr>
         <w:pStyle w:val="Heading3"/>
@@ -53254,8 +53744,8 @@
         <w:t xml:space="preserve">0|1 = phased (paternal=0, maternal=1)</w:t>
       </w:r>
     </w:p>
-    <w:bookmarkEnd w:id="287"/>
-    <w:bookmarkStart w:id="288" w:name="gq-genotype-quality"/>
+    <w:bookmarkEnd w:id="292"/>
+    <w:bookmarkStart w:id="293" w:name="gq-genotype-quality"/>
     <w:p>
       <w:pPr>
         <w:pStyle w:val="Heading3"/>
@@ -53283,8 +53773,8 @@
         <w:t xml:space="preserve">GQ=40 → P(genotype wrong) = 0.0001</w:t>
       </w:r>
     </w:p>
-    <w:bookmarkEnd w:id="288"/>
-    <w:bookmarkStart w:id="289" w:name="pl-phred-scaled-genotype-likelihoods"/>
+    <w:bookmarkEnd w:id="293"/>
+    <w:bookmarkStart w:id="294" w:name="pl-phred-scaled-genotype-likelihoods"/>
     <w:p>
       <w:pPr>
         <w:pStyle w:val="Heading3"/>
@@ -53759,9 +54249,9 @@
         </w:pict>
       </w:r>
     </w:p>
-    <w:bookmarkEnd w:id="289"/>
-    <w:bookmarkEnd w:id="290"/>
-    <w:bookmarkStart w:id="291" w:name="info-fields-per-variant"/>
+    <w:bookmarkEnd w:id="294"/>
+    <w:bookmarkEnd w:id="295"/>
+    <w:bookmarkStart w:id="296" w:name="info-fields-per-variant"/>
     <w:p>
       <w:pPr>
         <w:pStyle w:val="Heading2"/>
@@ -54148,8 +54638,8 @@
         </w:pict>
       </w:r>
     </w:p>
-    <w:bookmarkEnd w:id="291"/>
-    <w:bookmarkStart w:id="293" w:name="format-fields-per-sample-per-variant"/>
+    <w:bookmarkEnd w:id="296"/>
+    <w:bookmarkStart w:id="298" w:name="format-fields-per-sample-per-variant"/>
     <w:p>
       <w:pPr>
         <w:pStyle w:val="Heading2"/>
@@ -54418,7 +54908,7 @@
         </w:tc>
       </w:tr>
     </w:tbl>
-    <w:bookmarkStart w:id="292" w:name="ad-allele-depth"/>
+    <w:bookmarkStart w:id="297" w:name="ad-allele-depth"/>
     <w:p>
       <w:pPr>
         <w:pStyle w:val="Heading3"/>
@@ -54696,9 +55186,9 @@
         </w:pict>
       </w:r>
     </w:p>
-    <w:bookmarkEnd w:id="292"/>
-    <w:bookmarkEnd w:id="293"/>
-    <w:bookmarkStart w:id="297" w:name="vcf-filtering"/>
+    <w:bookmarkEnd w:id="297"/>
+    <w:bookmarkEnd w:id="298"/>
+    <w:bookmarkStart w:id="302" w:name="vcf-filtering"/>
     <w:p>
       <w:pPr>
         <w:pStyle w:val="Heading2"/>
@@ -54707,7 +55197,7 @@
         <w:t xml:space="preserve">5. VCF Filtering</w:t>
       </w:r>
     </w:p>
-    <w:bookmarkStart w:id="294" w:name="filter-column"/>
+    <w:bookmarkStart w:id="299" w:name="filter-column"/>
     <w:p>
       <w:pPr>
         <w:pStyle w:val="Heading3"/>
@@ -54763,8 +55253,8 @@
         <w:t xml:space="preserve">LowDepth       - insufficient depth</w:t>
       </w:r>
     </w:p>
-    <w:bookmarkEnd w:id="294"/>
-    <w:bookmarkStart w:id="295" w:name="filtering-variants"/>
+    <w:bookmarkEnd w:id="299"/>
+    <w:bookmarkStart w:id="300" w:name="filtering-variants"/>
     <w:p>
       <w:pPr>
         <w:pStyle w:val="Heading3"/>
@@ -55066,8 +55556,8 @@
         <w:t xml:space="preserve"> .,PASS input.vcf.gz</w:t>
       </w:r>
     </w:p>
-    <w:bookmarkEnd w:id="295"/>
-    <w:bookmarkStart w:id="296" w:name="complex-filtering-with-expressions"/>
+    <w:bookmarkEnd w:id="300"/>
+    <w:bookmarkStart w:id="301" w:name="complex-filtering-with-expressions"/>
     <w:p>
       <w:pPr>
         <w:pStyle w:val="Heading3"/>
@@ -55265,9 +55755,9 @@
         </w:pict>
       </w:r>
     </w:p>
-    <w:bookmarkEnd w:id="296"/>
-    <w:bookmarkEnd w:id="297"/>
-    <w:bookmarkStart w:id="300" w:name="annotation"/>
+    <w:bookmarkEnd w:id="301"/>
+    <w:bookmarkEnd w:id="302"/>
+    <w:bookmarkStart w:id="305" w:name="annotation"/>
     <w:p>
       <w:pPr>
         <w:pStyle w:val="Heading2"/>
@@ -55300,7 +55790,7 @@
         <w:t xml:space="preserve">adds biological context:</w:t>
       </w:r>
     </w:p>
-    <w:bookmarkStart w:id="298" w:name="using-snpeff-vep"/>
+    <w:bookmarkStart w:id="303" w:name="using-snpeff-vep"/>
     <w:p>
       <w:pPr>
         <w:pStyle w:val="Heading3"/>
@@ -55455,8 +55945,8 @@
         <w:t xml:space="preserve">--cache</w:t>
       </w:r>
     </w:p>
-    <w:bookmarkEnd w:id="298"/>
-    <w:bookmarkStart w:id="299" w:name="after-annotation-info-contains"/>
+    <w:bookmarkEnd w:id="303"/>
+    <w:bookmarkStart w:id="304" w:name="after-annotation-info-contains"/>
     <w:p>
       <w:pPr>
         <w:pStyle w:val="Heading3"/>
@@ -55501,9 +55991,9 @@
         </w:pict>
       </w:r>
     </w:p>
-    <w:bookmarkEnd w:id="299"/>
-    <w:bookmarkEnd w:id="300"/>
-    <w:bookmarkStart w:id="301" w:name="multi-sample-vcf"/>
+    <w:bookmarkEnd w:id="304"/>
+    <w:bookmarkEnd w:id="305"/>
+    <w:bookmarkStart w:id="306" w:name="multi-sample-vcf"/>
     <w:p>
       <w:pPr>
         <w:pStyle w:val="Heading2"/>
@@ -55699,8 +56189,8 @@
         </w:pict>
       </w:r>
     </w:p>
-    <w:bookmarkEnd w:id="301"/>
-    <w:bookmarkStart w:id="302" w:name="bcf-binary-vcf"/>
+    <w:bookmarkEnd w:id="306"/>
+    <w:bookmarkStart w:id="307" w:name="bcf-binary-vcf"/>
     <w:p>
       <w:pPr>
         <w:pStyle w:val="Heading2"/>
@@ -55900,8 +56390,8 @@
         </w:pict>
       </w:r>
     </w:p>
-    <w:bookmarkEnd w:id="302"/>
-    <w:bookmarkStart w:id="304" w:name="vcf-statistics"/>
+    <w:bookmarkEnd w:id="307"/>
+    <w:bookmarkStart w:id="309" w:name="vcf-statistics"/>
     <w:p>
       <w:pPr>
         <w:pStyle w:val="Heading2"/>
@@ -56209,7 +56699,7 @@
         <w:t xml:space="preserve"> truth.vcf.gz input.vcf.gz</w:t>
       </w:r>
     </w:p>
-    <w:bookmarkStart w:id="303" w:name="titv-ratio"/>
+    <w:bookmarkStart w:id="308" w:name="titv-ratio"/>
     <w:p>
       <w:pPr>
         <w:pStyle w:val="Heading3"/>
@@ -56284,9 +56774,9 @@
         </w:pict>
       </w:r>
     </w:p>
-    <w:bookmarkEnd w:id="303"/>
-    <w:bookmarkEnd w:id="304"/>
-    <w:bookmarkStart w:id="305" w:name="vcf-in-code-python"/>
+    <w:bookmarkEnd w:id="308"/>
+    <w:bookmarkEnd w:id="309"/>
+    <w:bookmarkStart w:id="310" w:name="vcf-in-code-python"/>
     <w:p>
       <w:pPr>
         <w:pStyle w:val="Heading2"/>
@@ -56943,8 +57433,8 @@
         </w:pict>
       </w:r>
     </w:p>
-    <w:bookmarkEnd w:id="305"/>
-    <w:bookmarkStart w:id="306" w:name="exercises-12"/>
+    <w:bookmarkEnd w:id="310"/>
+    <w:bookmarkStart w:id="311" w:name="exercises-12"/>
     <w:p>
       <w:pPr>
         <w:pStyle w:val="Heading2"/>
@@ -57082,8 +57572,8 @@
         </w:pict>
       </w:r>
     </w:p>
-    <w:bookmarkEnd w:id="306"/>
-    <w:bookmarkStart w:id="307" w:name="key-terms-12"/>
+    <w:bookmarkEnd w:id="311"/>
+    <w:bookmarkStart w:id="312" w:name="key-terms-12"/>
     <w:p>
       <w:pPr>
         <w:pStyle w:val="Heading2"/>
@@ -57425,8 +57915,8 @@
         </w:pict>
       </w:r>
     </w:p>
-    <w:bookmarkEnd w:id="307"/>
-    <w:bookmarkStart w:id="308" w:name="next-steps-12"/>
+    <w:bookmarkEnd w:id="312"/>
+    <w:bookmarkStart w:id="313" w:name="next-steps-12"/>
     <w:p>
       <w:pPr>
         <w:pStyle w:val="Heading2"/>
@@ -57498,9 +57988,9 @@
         <w:t xml:space="preserve">“A VCF file is a diff against the human reference. Interpret it the same way you’d read a code review.”</w:t>
       </w:r>
     </w:p>
-    <w:bookmarkEnd w:id="308"/>
-    <w:bookmarkEnd w:id="309"/>
-    <w:bookmarkStart w:id="332" w:name="samtools-deep-dive"/>
+    <w:bookmarkEnd w:id="313"/>
+    <w:bookmarkEnd w:id="314"/>
+    <w:bookmarkStart w:id="337" w:name="samtools-deep-dive"/>
     <w:p>
       <w:pPr>
         <w:pStyle w:val="Heading1"/>
@@ -57582,7 +58072,7 @@
         </w:pict>
       </w:r>
     </w:p>
-    <w:bookmarkStart w:id="310" w:name="the-big-idea-13"/>
+    <w:bookmarkStart w:id="315" w:name="the-big-idea-13"/>
     <w:p>
       <w:pPr>
         <w:pStyle w:val="Heading2"/>
@@ -57616,8 +58106,8 @@
         </w:pict>
       </w:r>
     </w:p>
-    <w:bookmarkEnd w:id="310"/>
-    <w:bookmarkStart w:id="311" w:name="essential-commands-summary"/>
+    <w:bookmarkEnd w:id="315"/>
+    <w:bookmarkStart w:id="316" w:name="essential-commands-summary"/>
     <w:p>
       <w:pPr>
         <w:pStyle w:val="Heading2"/>
@@ -57797,8 +58287,8 @@
         </w:pict>
       </w:r>
     </w:p>
-    <w:bookmarkEnd w:id="311"/>
-    <w:bookmarkStart w:id="312" w:name="samtools-view-the-most-important-command"/>
+    <w:bookmarkEnd w:id="316"/>
+    <w:bookmarkStart w:id="317" w:name="samtools-view-the-most-important-command"/>
     <w:p>
       <w:pPr>
         <w:pStyle w:val="Heading2"/>
@@ -58530,8 +59020,8 @@
         </w:pict>
       </w:r>
     </w:p>
-    <w:bookmarkEnd w:id="312"/>
-    <w:bookmarkStart w:id="313" w:name="Xd54c4f57520fb8773c322083534d8813b454155"/>
+    <w:bookmarkEnd w:id="317"/>
+    <w:bookmarkStart w:id="318" w:name="Xd54c4f57520fb8773c322083534d8813b454155"/>
     <w:p>
       <w:pPr>
         <w:pStyle w:val="Heading2"/>
@@ -58807,8 +59297,8 @@
         </w:pict>
       </w:r>
     </w:p>
-    <w:bookmarkEnd w:id="313"/>
-    <w:bookmarkStart w:id="314" w:name="Xb29e0229886d4104c738a6122aadf13d2b0b5e7"/>
+    <w:bookmarkEnd w:id="318"/>
+    <w:bookmarkStart w:id="319" w:name="Xb29e0229886d4104c738a6122aadf13d2b0b5e7"/>
     <w:p>
       <w:pPr>
         <w:pStyle w:val="Heading2"/>
@@ -59024,8 +59514,8 @@
         </w:pict>
       </w:r>
     </w:p>
-    <w:bookmarkEnd w:id="314"/>
-    <w:bookmarkStart w:id="316" w:name="samtools-stats-detailed-statistics"/>
+    <w:bookmarkEnd w:id="319"/>
+    <w:bookmarkStart w:id="321" w:name="samtools-stats-detailed-statistics"/>
     <w:p>
       <w:pPr>
         <w:pStyle w:val="Heading2"/>
@@ -59222,7 +59712,7 @@
         <w:t xml:space="preserve"># GC depth distribution</w:t>
       </w:r>
     </w:p>
-    <w:bookmarkStart w:id="315" w:name="parsing-stats-output"/>
+    <w:bookmarkStart w:id="320" w:name="parsing-stats-output"/>
     <w:p>
       <w:pPr>
         <w:pStyle w:val="Heading3"/>
@@ -59354,9 +59844,9 @@
         </w:pict>
       </w:r>
     </w:p>
-    <w:bookmarkEnd w:id="315"/>
-    <w:bookmarkEnd w:id="316"/>
-    <w:bookmarkStart w:id="317" w:name="samtools-depth-coverage-analysis"/>
+    <w:bookmarkEnd w:id="320"/>
+    <w:bookmarkEnd w:id="321"/>
+    <w:bookmarkStart w:id="322" w:name="samtools-depth-coverage-analysis"/>
     <w:p>
       <w:pPr>
         <w:pStyle w:val="Heading2"/>
@@ -59812,8 +60302,8 @@
         </w:pict>
       </w:r>
     </w:p>
-    <w:bookmarkEnd w:id="317"/>
-    <w:bookmarkStart w:id="318" w:name="samtools-mpileup-variant-calling"/>
+    <w:bookmarkEnd w:id="322"/>
+    <w:bookmarkStart w:id="323" w:name="samtools-mpileup-variant-calling"/>
     <w:p>
       <w:pPr>
         <w:pStyle w:val="Heading2"/>
@@ -60002,8 +60492,8 @@
         </w:pict>
       </w:r>
     </w:p>
-    <w:bookmarkEnd w:id="318"/>
-    <w:bookmarkStart w:id="319" w:name="X8835c9e6d9360ff534457983eaa564671197c5e"/>
+    <w:bookmarkEnd w:id="323"/>
+    <w:bookmarkStart w:id="324" w:name="X8835c9e6d9360ff534457983eaa564671197c5e"/>
     <w:p>
       <w:pPr>
         <w:pStyle w:val="Heading2"/>
@@ -60200,8 +60690,8 @@
         </w:pict>
       </w:r>
     </w:p>
-    <w:bookmarkEnd w:id="319"/>
-    <w:bookmarkStart w:id="320" w:name="Xe24707c7543a49617ac2e321d321edd1186de5d"/>
+    <w:bookmarkEnd w:id="324"/>
+    <w:bookmarkStart w:id="325" w:name="Xe24707c7543a49617ac2e321d321edd1186de5d"/>
     <w:p>
       <w:pPr>
         <w:pStyle w:val="Heading2"/>
@@ -60309,8 +60799,8 @@
         </w:pict>
       </w:r>
     </w:p>
-    <w:bookmarkEnd w:id="320"/>
-    <w:bookmarkStart w:id="321" w:name="samtools-merge-and-samtools-cat"/>
+    <w:bookmarkEnd w:id="325"/>
+    <w:bookmarkStart w:id="326" w:name="samtools-merge-and-samtools-cat"/>
     <w:p>
       <w:pPr>
         <w:pStyle w:val="Heading2"/>
@@ -60454,8 +60944,8 @@
         </w:pict>
       </w:r>
     </w:p>
-    <w:bookmarkEnd w:id="321"/>
-    <w:bookmarkStart w:id="322" w:name="samtools-fastq-bam-to-fastq"/>
+    <w:bookmarkEnd w:id="326"/>
+    <w:bookmarkStart w:id="327" w:name="samtools-fastq-bam-to-fastq"/>
     <w:p>
       <w:pPr>
         <w:pStyle w:val="Heading2"/>
@@ -60650,8 +61140,8 @@
         </w:pict>
       </w:r>
     </w:p>
-    <w:bookmarkEnd w:id="322"/>
-    <w:bookmarkStart w:id="323" w:name="samtools-calmd-md-tag-calculation"/>
+    <w:bookmarkEnd w:id="327"/>
+    <w:bookmarkStart w:id="328" w:name="samtools-calmd-md-tag-calculation"/>
     <w:p>
       <w:pPr>
         <w:pStyle w:val="Heading2"/>
@@ -60777,8 +61267,8 @@
         </w:pict>
       </w:r>
     </w:p>
-    <w:bookmarkEnd w:id="323"/>
-    <w:bookmarkStart w:id="324" w:name="samtools-tview-text-based-viewer"/>
+    <w:bookmarkEnd w:id="328"/>
+    <w:bookmarkStart w:id="329" w:name="samtools-tview-text-based-viewer"/>
     <w:p>
       <w:pPr>
         <w:pStyle w:val="Heading2"/>
@@ -60931,8 +61421,8 @@
         </w:pict>
       </w:r>
     </w:p>
-    <w:bookmarkEnd w:id="324"/>
-    <w:bookmarkStart w:id="325" w:name="piping-and-chaining"/>
+    <w:bookmarkEnd w:id="329"/>
+    <w:bookmarkStart w:id="330" w:name="piping-and-chaining"/>
     <w:p>
       <w:pPr>
         <w:pStyle w:val="Heading2"/>
@@ -61351,8 +61841,8 @@
         </w:pict>
       </w:r>
     </w:p>
-    <w:bookmarkEnd w:id="325"/>
-    <w:bookmarkStart w:id="328" w:name="common-workflows"/>
+    <w:bookmarkEnd w:id="330"/>
+    <w:bookmarkStart w:id="333" w:name="common-workflows"/>
     <w:p>
       <w:pPr>
         <w:pStyle w:val="Heading2"/>
@@ -61361,7 +61851,7 @@
         <w:t xml:space="preserve">15. Common Workflows</w:t>
       </w:r>
     </w:p>
-    <w:bookmarkStart w:id="326" w:name="full-alignment-pipeline"/>
+    <w:bookmarkStart w:id="331" w:name="full-alignment-pipeline"/>
     <w:p>
       <w:pPr>
         <w:pStyle w:val="Heading3"/>
@@ -62118,8 +62608,8 @@
         <w:t xml:space="preserve">.stats</w:t>
       </w:r>
     </w:p>
-    <w:bookmarkEnd w:id="326"/>
-    <w:bookmarkStart w:id="327" w:name="calling-variants"/>
+    <w:bookmarkEnd w:id="331"/>
+    <w:bookmarkStart w:id="332" w:name="calling-variants"/>
     <w:p>
       <w:pPr>
         <w:pStyle w:val="Heading3"/>
@@ -62227,9 +62717,9 @@
         </w:pict>
       </w:r>
     </w:p>
-    <w:bookmarkEnd w:id="327"/>
-    <w:bookmarkEnd w:id="328"/>
-    <w:bookmarkStart w:id="329" w:name="exercises-13"/>
+    <w:bookmarkEnd w:id="332"/>
+    <w:bookmarkEnd w:id="333"/>
+    <w:bookmarkStart w:id="334" w:name="exercises-13"/>
     <w:p>
       <w:pPr>
         <w:pStyle w:val="Heading2"/>
@@ -62335,8 +62825,8 @@
         </w:pict>
       </w:r>
     </w:p>
-    <w:bookmarkEnd w:id="329"/>
-    <w:bookmarkStart w:id="330" w:name="key-terms-13"/>
+    <w:bookmarkEnd w:id="334"/>
+    <w:bookmarkStart w:id="335" w:name="key-terms-13"/>
     <w:p>
       <w:pPr>
         <w:pStyle w:val="Heading2"/>
@@ -62582,8 +63072,8 @@
         </w:pict>
       </w:r>
     </w:p>
-    <w:bookmarkEnd w:id="330"/>
-    <w:bookmarkStart w:id="331" w:name="next-steps-13"/>
+    <w:bookmarkEnd w:id="335"/>
+    <w:bookmarkStart w:id="336" w:name="next-steps-13"/>
     <w:p>
       <w:pPr>
         <w:pStyle w:val="Heading2"/>
@@ -62634,9 +63124,9 @@
         <w:t xml:space="preserve">“If you only master one tool in genomics, make it SAMtools. Everything flows through BAM.”</w:t>
       </w:r>
     </w:p>
-    <w:bookmarkEnd w:id="331"/>
-    <w:bookmarkEnd w:id="332"/>
-    <w:bookmarkStart w:id="357" w:name="bcftools-deep-dive"/>
+    <w:bookmarkEnd w:id="336"/>
+    <w:bookmarkEnd w:id="337"/>
+    <w:bookmarkStart w:id="362" w:name="bcftools-deep-dive"/>
     <w:p>
       <w:pPr>
         <w:pStyle w:val="Heading1"/>
@@ -62685,7 +63175,7 @@
         </w:pict>
       </w:r>
     </w:p>
-    <w:bookmarkStart w:id="333" w:name="the-big-idea-14"/>
+    <w:bookmarkStart w:id="338" w:name="the-big-idea-14"/>
     <w:p>
       <w:pPr>
         <w:pStyle w:val="Heading2"/>
@@ -62739,8 +63229,8 @@
         </w:pict>
       </w:r>
     </w:p>
-    <w:bookmarkEnd w:id="333"/>
-    <w:bookmarkStart w:id="334" w:name="essential-commands-summary-1"/>
+    <w:bookmarkEnd w:id="338"/>
+    <w:bookmarkStart w:id="339" w:name="essential-commands-summary-1"/>
     <w:p>
       <w:pPr>
         <w:pStyle w:val="Heading2"/>
@@ -62902,8 +63392,8 @@
         </w:pict>
       </w:r>
     </w:p>
-    <w:bookmarkEnd w:id="334"/>
-    <w:bookmarkStart w:id="335" w:name="bcftools-view-the-swiss-army-knife"/>
+    <w:bookmarkEnd w:id="339"/>
+    <w:bookmarkStart w:id="340" w:name="bcftools-view-the-swiss-army-knife"/>
     <w:p>
       <w:pPr>
         <w:pStyle w:val="Heading2"/>
@@ -63590,8 +64080,8 @@
         </w:pict>
       </w:r>
     </w:p>
-    <w:bookmarkEnd w:id="335"/>
-    <w:bookmarkStart w:id="339" w:name="X175fdb6b08d988b1eecf84dd565ebdd91394f2d"/>
+    <w:bookmarkEnd w:id="340"/>
+    <w:bookmarkStart w:id="344" w:name="X175fdb6b08d988b1eecf84dd565ebdd91394f2d"/>
     <w:p>
       <w:pPr>
         <w:pStyle w:val="Heading2"/>
@@ -63615,7 +64105,7 @@
         <w:t xml:space="preserve">— Expression-Based Filtering</w:t>
       </w:r>
     </w:p>
-    <w:bookmarkStart w:id="336" w:name="simple-filters"/>
+    <w:bookmarkStart w:id="341" w:name="simple-filters"/>
     <w:p>
       <w:pPr>
         <w:pStyle w:val="Heading3"/>
@@ -63827,8 +64317,8 @@
         <w:t xml:space="preserve"> input.vcf.gz</w:t>
       </w:r>
     </w:p>
-    <w:bookmarkEnd w:id="336"/>
-    <w:bookmarkStart w:id="337" w:name="complex-filters"/>
+    <w:bookmarkEnd w:id="341"/>
+    <w:bookmarkStart w:id="342" w:name="complex-filters"/>
     <w:p>
       <w:pPr>
         <w:pStyle w:val="Heading3"/>
@@ -64115,8 +64605,8 @@
         <w:t xml:space="preserve">  input.vcf.gz</w:t>
       </w:r>
     </w:p>
-    <w:bookmarkEnd w:id="337"/>
-    <w:bookmarkStart w:id="338" w:name="expression-functions"/>
+    <w:bookmarkEnd w:id="342"/>
+    <w:bookmarkStart w:id="343" w:name="expression-functions"/>
     <w:p>
       <w:pPr>
         <w:pStyle w:val="Heading3"/>
@@ -64132,9 +64622,9 @@
         </w:pict>
       </w:r>
     </w:p>
-    <w:bookmarkEnd w:id="338"/>
-    <w:bookmarkEnd w:id="339"/>
-    <w:bookmarkStart w:id="341" w:name="bcftools-query-fast-field-extraction"/>
+    <w:bookmarkEnd w:id="343"/>
+    <w:bookmarkEnd w:id="344"/>
+    <w:bookmarkStart w:id="346" w:name="bcftools-query-fast-field-extraction"/>
     <w:p>
       <w:pPr>
         <w:pStyle w:val="Heading2"/>
@@ -64495,7 +64985,7 @@
         <w:t xml:space="preserve"># INFO definitions</w:t>
       </w:r>
     </w:p>
-    <w:bookmarkStart w:id="340" w:name="query-format-specifiers"/>
+    <w:bookmarkStart w:id="345" w:name="query-format-specifiers"/>
     <w:p>
       <w:pPr>
         <w:pStyle w:val="Heading3"/>
@@ -64612,9 +65102,9 @@
         </w:pict>
       </w:r>
     </w:p>
-    <w:bookmarkEnd w:id="340"/>
-    <w:bookmarkEnd w:id="341"/>
-    <w:bookmarkStart w:id="343" w:name="bcftools-stats-comprehensive-statistics"/>
+    <w:bookmarkEnd w:id="345"/>
+    <w:bookmarkEnd w:id="346"/>
+    <w:bookmarkStart w:id="348" w:name="bcftools-stats-comprehensive-statistics"/>
     <w:p>
       <w:pPr>
         <w:pStyle w:val="Heading2"/>
@@ -64853,7 +65343,7 @@
         <w:t xml:space="preserve"># Quality distribution</w:t>
       </w:r>
     </w:p>
-    <w:bookmarkStart w:id="342" w:name="key-metrics-from-bcftools-stats"/>
+    <w:bookmarkStart w:id="347" w:name="key-metrics-from-bcftools-stats"/>
     <w:p>
       <w:pPr>
         <w:pStyle w:val="Heading3"/>
@@ -64952,9 +65442,9 @@
         </w:pict>
       </w:r>
     </w:p>
-    <w:bookmarkEnd w:id="342"/>
-    <w:bookmarkEnd w:id="343"/>
-    <w:bookmarkStart w:id="344" w:name="Xc2f4b69806a43c9e8654e769e3e346669e663b5"/>
+    <w:bookmarkEnd w:id="347"/>
+    <w:bookmarkEnd w:id="348"/>
+    <w:bookmarkStart w:id="349" w:name="Xc2f4b69806a43c9e8654e769e3e346669e663b5"/>
     <w:p>
       <w:pPr>
         <w:pStyle w:val="Heading2"/>
@@ -65268,8 +65758,8 @@
         </w:pict>
       </w:r>
     </w:p>
-    <w:bookmarkEnd w:id="344"/>
-    <w:bookmarkStart w:id="345" w:name="X26523a9822bf662b1eb42d8970c29aaf1accda4"/>
+    <w:bookmarkEnd w:id="349"/>
+    <w:bookmarkStart w:id="350" w:name="X26523a9822bf662b1eb42d8970c29aaf1accda4"/>
     <w:p>
       <w:pPr>
         <w:pStyle w:val="Heading2"/>
@@ -65545,8 +66035,8 @@
         </w:pict>
       </w:r>
     </w:p>
-    <w:bookmarkEnd w:id="345"/>
-    <w:bookmarkStart w:id="347" w:name="bcftools-norm-normalization"/>
+    <w:bookmarkEnd w:id="350"/>
+    <w:bookmarkStart w:id="352" w:name="bcftools-norm-normalization"/>
     <w:p>
       <w:pPr>
         <w:pStyle w:val="Heading2"/>
@@ -65754,7 +66244,7 @@
         <w:t xml:space="preserve"> merged_back.vcf.gz</w:t>
       </w:r>
     </w:p>
-    <w:bookmarkStart w:id="346" w:name="why-normalization-matters"/>
+    <w:bookmarkStart w:id="351" w:name="why-normalization-matters"/>
     <w:p>
       <w:pPr>
         <w:pStyle w:val="Heading3"/>
@@ -65820,9 +66310,9 @@
         </w:pict>
       </w:r>
     </w:p>
-    <w:bookmarkEnd w:id="346"/>
-    <w:bookmarkEnd w:id="347"/>
-    <w:bookmarkStart w:id="348" w:name="X1906806504e8e6199ab1433166b3aef1c678520"/>
+    <w:bookmarkEnd w:id="351"/>
+    <w:bookmarkEnd w:id="352"/>
+    <w:bookmarkStart w:id="353" w:name="X1906806504e8e6199ab1433166b3aef1c678520"/>
     <w:p>
       <w:pPr>
         <w:pStyle w:val="Heading2"/>
@@ -66083,8 +66573,8 @@
         </w:pict>
       </w:r>
     </w:p>
-    <w:bookmarkEnd w:id="348"/>
-    <w:bookmarkStart w:id="349" w:name="bcftools-call-variant-calling"/>
+    <w:bookmarkEnd w:id="353"/>
+    <w:bookmarkStart w:id="354" w:name="bcftools-call-variant-calling"/>
     <w:p>
       <w:pPr>
         <w:pStyle w:val="Heading2"/>
@@ -66623,8 +67113,8 @@
         </w:pict>
       </w:r>
     </w:p>
-    <w:bookmarkEnd w:id="349"/>
-    <w:bookmarkStart w:id="350" w:name="Xdeec13bf3b0bde8f408cc258411b90882361c2a"/>
+    <w:bookmarkEnd w:id="354"/>
+    <w:bookmarkStart w:id="355" w:name="Xdeec13bf3b0bde8f408cc258411b90882361c2a"/>
     <w:p>
       <w:pPr>
         <w:pStyle w:val="Heading2"/>
@@ -66831,8 +67321,8 @@
         </w:pict>
       </w:r>
     </w:p>
-    <w:bookmarkEnd w:id="350"/>
-    <w:bookmarkStart w:id="351" w:name="X1d9f4ab82ef6a55dc68dfb9586a4d03002231b1"/>
+    <w:bookmarkEnd w:id="355"/>
+    <w:bookmarkStart w:id="356" w:name="X1d9f4ab82ef6a55dc68dfb9586a4d03002231b1"/>
     <w:p>
       <w:pPr>
         <w:pStyle w:val="Heading2"/>
@@ -67051,8 +67541,8 @@
         </w:pict>
       </w:r>
     </w:p>
-    <w:bookmarkEnd w:id="351"/>
-    <w:bookmarkStart w:id="352" w:name="bcftools-gtcheck-sample-concordance"/>
+    <w:bookmarkEnd w:id="356"/>
+    <w:bookmarkStart w:id="357" w:name="bcftools-gtcheck-sample-concordance"/>
     <w:p>
       <w:pPr>
         <w:pStyle w:val="Heading2"/>
@@ -67178,8 +67668,8 @@
         </w:pict>
       </w:r>
     </w:p>
-    <w:bookmarkEnd w:id="352"/>
-    <w:bookmarkStart w:id="353" w:name="complete-workflow-bam-to-filtered-vcf"/>
+    <w:bookmarkEnd w:id="357"/>
+    <w:bookmarkStart w:id="358" w:name="complete-workflow-bam-to-filtered-vcf"/>
     <w:p>
       <w:pPr>
         <w:pStyle w:val="Heading2"/>
@@ -68018,8 +68508,8 @@
         </w:pict>
       </w:r>
     </w:p>
-    <w:bookmarkEnd w:id="353"/>
-    <w:bookmarkStart w:id="354" w:name="exercises-14"/>
+    <w:bookmarkEnd w:id="358"/>
+    <w:bookmarkStart w:id="359" w:name="exercises-14"/>
     <w:p>
       <w:pPr>
         <w:pStyle w:val="Heading2"/>
@@ -68137,8 +68627,8 @@
         </w:pict>
       </w:r>
     </w:p>
-    <w:bookmarkEnd w:id="354"/>
-    <w:bookmarkStart w:id="355" w:name="key-terms-14"/>
+    <w:bookmarkEnd w:id="359"/>
+    <w:bookmarkStart w:id="360" w:name="key-terms-14"/>
     <w:p>
       <w:pPr>
         <w:pStyle w:val="Heading2"/>
@@ -68384,8 +68874,8 @@
         </w:pict>
       </w:r>
     </w:p>
-    <w:bookmarkEnd w:id="355"/>
-    <w:bookmarkStart w:id="356" w:name="next-steps-14"/>
+    <w:bookmarkEnd w:id="360"/>
+    <w:bookmarkStart w:id="361" w:name="next-steps-14"/>
     <w:p>
       <w:pPr>
         <w:pStyle w:val="Heading2"/>
@@ -68413,8 +68903,8 @@
         <w:t xml:space="preserve">“SAMtools makes BAM files speak. BCFtools makes VCF files sing.”</w:t>
       </w:r>
     </w:p>
-    <w:bookmarkEnd w:id="356"/>
-    <w:bookmarkEnd w:id="357"/>
+    <w:bookmarkEnd w:id="361"/>
+    <w:bookmarkEnd w:id="362"/>
     <w:sectPr>
       <w:footnotePr>
         <w:numRestart w:val="eachSect"/>

</xml_diff>